<commit_message>
Reorganização do repositório do TCC
</commit_message>
<xml_diff>
--- a/TCC/TCC-Documentacao.docx
+++ b/TCC/TCC-Documentacao.docx
@@ -1754,10 +1754,7 @@
         <w:jc w:val="both"/>
       </w:pPr>
       <w:r>
-        <w:t>A Indústria XYZ precisa monitorar as não conformidades na entrada de materiais de seus fornecedores para manter-se em conformid</w:t>
-      </w:r>
-      <w:r>
-        <w:t>ade com a certificação ISO 9001. Para isso, o sistema registra, no módulo de Compras (SIGACOM) do Protheus, dois conjuntos de informação: os certificados de qualidade dos fornecedores e as ocorrências de não conformidade verificadas em cada entrega.</w:t>
+        <w:t>A Indústria XYZ precisa monitorar as não conformidades na entrada de materiais de seus fornecedores para manter-se em conformidade com a certificação ISO 9001. Para isso, o sistema registra, no módulo de Compras (SIGACOM) do Protheus, dois conjuntos de informação: os certificados de qualidade dos fornecedores e as ocorrências de não conformidade verificadas em cada entrega.</w:t>
       </w:r>
     </w:p>
     <w:p>
@@ -1766,10 +1763,7 @@
         <w:jc w:val="both"/>
       </w:pPr>
       <w:r>
-        <w:t>O cont</w:t>
-      </w:r>
-      <w:r>
-        <w:t>role é realizado por meio de duas tabelas próprias, vinculadas às tabelas padrão do ERP — Cadastro de Fornecedores (SA2) e Cadastro de Produtos (SB1):</w:t>
+        <w:t>O controle é realizado por meio de duas tabelas próprias, vinculadas às tabelas padrão do ERP — Cadastro de Fornecedores (SA2) e Cadastro de Produtos (SB1):</w:t>
       </w:r>
     </w:p>
     <w:p>
@@ -1782,10 +1776,7 @@
         <w:spacing w:after="60"/>
       </w:pPr>
       <w:r>
-        <w:t>ZZ1 — Controle de Fornecimento: guarda, por fornecedor, os dados do certificado de qualidade, sua validad</w:t>
-      </w:r>
-      <w:r>
-        <w:t>e e a tolerância percentual de não conformidade aceita.</w:t>
+        <w:t>ZZ1 — Controle de Fornecimento: guarda, por fornecedor, os dados do certificado de qualidade, sua validade e a tolerância percentual de não conformidade aceita.</w:t>
       </w:r>
     </w:p>
     <w:p>
@@ -1807,13 +1798,7 @@
         <w:jc w:val="both"/>
       </w:pPr>
       <w:r>
-        <w:t>A partir dess</w:t>
-      </w:r>
-      <w:r>
-        <w:t>es dados, o sistema sinaliza visualmente (por legendas coloridas) tanto os certificados vencidos ou próximos do vencimento quanto as entregas cujo percentual de não conformidade ultrapassa a tolerância acordada, permitindo ação rápida da equipe de qualidad</w:t>
-      </w:r>
-      <w:r>
-        <w:t>e e de compras.</w:t>
+        <w:t>A partir desses dados, o sistema sinaliza visualmente (por legendas coloridas) tanto os certificados vencidos ou próximos do vencimento quanto as entregas cujo percentual de não conformidade ultrapassa a tolerância acordada, permitindo ação rápida da equipe de qualidade e de compras.</w:t>
       </w:r>
     </w:p>
     <w:p>
@@ -1921,10 +1906,7 @@
         <w:jc w:val="both"/>
       </w:pPr>
       <w:r>
-        <w:t>As duas tabelas são compa</w:t>
-      </w:r>
-      <w:r>
-        <w:t>rtilhadas (mesmo conteúdo entre filiais) e residem no módulo de Compras. Abaixo, a estrutura completa de campos e índices. Os campos marcados como Virtual não são gravados fisicamente: seu conteúdo é calculado em tempo de exibição (X3_CONTEXT = "V").</w:t>
+        <w:t>As duas tabelas são compartilhadas (mesmo conteúdo entre filiais) e residem no módulo de Compras. Abaixo, a estrutura completa de campos e índices. Os campos marcados como Virtual não são gravados fisicamente: seu conteúdo é calculado em tempo de exibição (X3_CONTEXT = "V").</w:t>
       </w:r>
     </w:p>
     <w:p>
@@ -1939,15 +1921,7 @@
           <w:bCs/>
           <w:color w:val="2E5496"/>
         </w:rPr>
-        <w:t>2.1 Z</w:t>
-      </w:r>
-      <w:r>
-        <w:rPr>
-          <w:b/>
-          <w:bCs/>
-          <w:color w:val="2E5496"/>
-        </w:rPr>
-        <w:t>Z1 — Controle de Fornecimento</w:t>
+        <w:t>2.1 ZZ1 — Controle de Fornecimento</w:t>
       </w:r>
       <w:bookmarkEnd w:id="4"/>
     </w:p>
@@ -1978,12 +1952,6 @@
         <w:gridCol w:w="2160"/>
       </w:tblGrid>
       <w:tr>
-        <w:tblPrEx>
-          <w:tblCellMar>
-            <w:top w:w="0" w:type="dxa"/>
-            <w:bottom w:w="0" w:type="dxa"/>
-          </w:tblCellMar>
-        </w:tblPrEx>
         <w:trPr>
           <w:tblHeader/>
         </w:trPr>
@@ -2161,12 +2129,6 @@
         </w:tc>
       </w:tr>
       <w:tr>
-        <w:tblPrEx>
-          <w:tblCellMar>
-            <w:top w:w="0" w:type="dxa"/>
-            <w:bottom w:w="0" w:type="dxa"/>
-          </w:tblCellMar>
-        </w:tblPrEx>
         <w:tc>
           <w:tcPr>
             <w:tcW w:w="1100" w:type="dxa"/>
@@ -2316,12 +2278,6 @@
         </w:tc>
       </w:tr>
       <w:tr>
-        <w:tblPrEx>
-          <w:tblCellMar>
-            <w:top w:w="0" w:type="dxa"/>
-            <w:bottom w:w="0" w:type="dxa"/>
-          </w:tblCellMar>
-        </w:tblPrEx>
         <w:tc>
           <w:tcPr>
             <w:tcW w:w="1100" w:type="dxa"/>
@@ -2478,12 +2434,6 @@
         </w:tc>
       </w:tr>
       <w:tr>
-        <w:tblPrEx>
-          <w:tblCellMar>
-            <w:top w:w="0" w:type="dxa"/>
-            <w:bottom w:w="0" w:type="dxa"/>
-          </w:tblCellMar>
-        </w:tblPrEx>
         <w:tc>
           <w:tcPr>
             <w:tcW w:w="1100" w:type="dxa"/>
@@ -2633,12 +2583,6 @@
         </w:tc>
       </w:tr>
       <w:tr>
-        <w:tblPrEx>
-          <w:tblCellMar>
-            <w:top w:w="0" w:type="dxa"/>
-            <w:bottom w:w="0" w:type="dxa"/>
-          </w:tblCellMar>
-        </w:tblPrEx>
         <w:tc>
           <w:tcPr>
             <w:tcW w:w="1100" w:type="dxa"/>
@@ -2795,12 +2739,6 @@
         </w:tc>
       </w:tr>
       <w:tr>
-        <w:tblPrEx>
-          <w:tblCellMar>
-            <w:top w:w="0" w:type="dxa"/>
-            <w:bottom w:w="0" w:type="dxa"/>
-          </w:tblCellMar>
-        </w:tblPrEx>
         <w:tc>
           <w:tcPr>
             <w:tcW w:w="1100" w:type="dxa"/>
@@ -2950,12 +2888,6 @@
         </w:tc>
       </w:tr>
       <w:tr>
-        <w:tblPrEx>
-          <w:tblCellMar>
-            <w:top w:w="0" w:type="dxa"/>
-            <w:bottom w:w="0" w:type="dxa"/>
-          </w:tblCellMar>
-        </w:tblPrEx>
         <w:tc>
           <w:tcPr>
             <w:tcW w:w="1100" w:type="dxa"/>
@@ -3112,12 +3044,6 @@
         </w:tc>
       </w:tr>
       <w:tr>
-        <w:tblPrEx>
-          <w:tblCellMar>
-            <w:top w:w="0" w:type="dxa"/>
-            <w:bottom w:w="0" w:type="dxa"/>
-          </w:tblCellMar>
-        </w:tblPrEx>
         <w:tc>
           <w:tcPr>
             <w:tcW w:w="1100" w:type="dxa"/>
@@ -3267,12 +3193,6 @@
         </w:tc>
       </w:tr>
       <w:tr>
-        <w:tblPrEx>
-          <w:tblCellMar>
-            <w:top w:w="0" w:type="dxa"/>
-            <w:bottom w:w="0" w:type="dxa"/>
-          </w:tblCellMar>
-        </w:tblPrEx>
         <w:tc>
           <w:tcPr>
             <w:tcW w:w="1100" w:type="dxa"/>
@@ -3429,12 +3349,6 @@
         </w:tc>
       </w:tr>
       <w:tr>
-        <w:tblPrEx>
-          <w:tblCellMar>
-            <w:top w:w="0" w:type="dxa"/>
-            <w:bottom w:w="0" w:type="dxa"/>
-          </w:tblCellMar>
-        </w:tblPrEx>
         <w:tc>
           <w:tcPr>
             <w:tcW w:w="1100" w:type="dxa"/>
@@ -3594,12 +3508,6 @@
         </w:tc>
       </w:tr>
       <w:tr>
-        <w:tblPrEx>
-          <w:tblCellMar>
-            <w:top w:w="0" w:type="dxa"/>
-            <w:bottom w:w="0" w:type="dxa"/>
-          </w:tblCellMar>
-        </w:tblPrEx>
         <w:tc>
           <w:tcPr>
             <w:tcW w:w="1100" w:type="dxa"/>
@@ -3795,12 +3703,6 @@
         <w:gridCol w:w="3160"/>
       </w:tblGrid>
       <w:tr>
-        <w:tblPrEx>
-          <w:tblCellMar>
-            <w:top w:w="0" w:type="dxa"/>
-            <w:bottom w:w="0" w:type="dxa"/>
-          </w:tblCellMar>
-        </w:tblPrEx>
         <w:trPr>
           <w:tblHeader/>
         </w:trPr>
@@ -3878,12 +3780,6 @@
         </w:tc>
       </w:tr>
       <w:tr>
-        <w:tblPrEx>
-          <w:tblCellMar>
-            <w:top w:w="0" w:type="dxa"/>
-            <w:bottom w:w="0" w:type="dxa"/>
-          </w:tblCellMar>
-        </w:tblPrEx>
         <w:tc>
           <w:tcPr>
             <w:tcW w:w="1000" w:type="dxa"/>
@@ -3949,12 +3845,6 @@
         </w:tc>
       </w:tr>
       <w:tr>
-        <w:tblPrEx>
-          <w:tblCellMar>
-            <w:top w:w="0" w:type="dxa"/>
-            <w:bottom w:w="0" w:type="dxa"/>
-          </w:tblCellMar>
-        </w:tblPrEx>
         <w:tc>
           <w:tcPr>
             <w:tcW w:w="1000" w:type="dxa"/>
@@ -4024,12 +3914,6 @@
         </w:tc>
       </w:tr>
       <w:tr>
-        <w:tblPrEx>
-          <w:tblCellMar>
-            <w:top w:w="0" w:type="dxa"/>
-            <w:bottom w:w="0" w:type="dxa"/>
-          </w:tblCellMar>
-        </w:tblPrEx>
         <w:tc>
           <w:tcPr>
             <w:tcW w:w="1000" w:type="dxa"/>
@@ -4138,12 +4022,6 @@
         <w:gridCol w:w="2160"/>
       </w:tblGrid>
       <w:tr>
-        <w:tblPrEx>
-          <w:tblCellMar>
-            <w:top w:w="0" w:type="dxa"/>
-            <w:bottom w:w="0" w:type="dxa"/>
-          </w:tblCellMar>
-        </w:tblPrEx>
         <w:trPr>
           <w:tblHeader/>
         </w:trPr>
@@ -4321,12 +4199,6 @@
         </w:tc>
       </w:tr>
       <w:tr>
-        <w:tblPrEx>
-          <w:tblCellMar>
-            <w:top w:w="0" w:type="dxa"/>
-            <w:bottom w:w="0" w:type="dxa"/>
-          </w:tblCellMar>
-        </w:tblPrEx>
         <w:tc>
           <w:tcPr>
             <w:tcW w:w="1100" w:type="dxa"/>
@@ -4476,12 +4348,6 @@
         </w:tc>
       </w:tr>
       <w:tr>
-        <w:tblPrEx>
-          <w:tblCellMar>
-            <w:top w:w="0" w:type="dxa"/>
-            <w:bottom w:w="0" w:type="dxa"/>
-          </w:tblCellMar>
-        </w:tblPrEx>
         <w:tc>
           <w:tcPr>
             <w:tcW w:w="1100" w:type="dxa"/>
@@ -4638,12 +4504,6 @@
         </w:tc>
       </w:tr>
       <w:tr>
-        <w:tblPrEx>
-          <w:tblCellMar>
-            <w:top w:w="0" w:type="dxa"/>
-            <w:bottom w:w="0" w:type="dxa"/>
-          </w:tblCellMar>
-        </w:tblPrEx>
         <w:tc>
           <w:tcPr>
             <w:tcW w:w="1100" w:type="dxa"/>
@@ -4793,12 +4653,6 @@
         </w:tc>
       </w:tr>
       <w:tr>
-        <w:tblPrEx>
-          <w:tblCellMar>
-            <w:top w:w="0" w:type="dxa"/>
-            <w:bottom w:w="0" w:type="dxa"/>
-          </w:tblCellMar>
-        </w:tblPrEx>
         <w:tc>
           <w:tcPr>
             <w:tcW w:w="1100" w:type="dxa"/>
@@ -4955,12 +4809,6 @@
         </w:tc>
       </w:tr>
       <w:tr>
-        <w:tblPrEx>
-          <w:tblCellMar>
-            <w:top w:w="0" w:type="dxa"/>
-            <w:bottom w:w="0" w:type="dxa"/>
-          </w:tblCellMar>
-        </w:tblPrEx>
         <w:tc>
           <w:tcPr>
             <w:tcW w:w="1100" w:type="dxa"/>
@@ -5110,12 +4958,6 @@
         </w:tc>
       </w:tr>
       <w:tr>
-        <w:tblPrEx>
-          <w:tblCellMar>
-            <w:top w:w="0" w:type="dxa"/>
-            <w:bottom w:w="0" w:type="dxa"/>
-          </w:tblCellMar>
-        </w:tblPrEx>
         <w:tc>
           <w:tcPr>
             <w:tcW w:w="1100" w:type="dxa"/>
@@ -5272,12 +5114,6 @@
         </w:tc>
       </w:tr>
       <w:tr>
-        <w:tblPrEx>
-          <w:tblCellMar>
-            <w:top w:w="0" w:type="dxa"/>
-            <w:bottom w:w="0" w:type="dxa"/>
-          </w:tblCellMar>
-        </w:tblPrEx>
         <w:tc>
           <w:tcPr>
             <w:tcW w:w="1100" w:type="dxa"/>
@@ -5427,12 +5263,6 @@
         </w:tc>
       </w:tr>
       <w:tr>
-        <w:tblPrEx>
-          <w:tblCellMar>
-            <w:top w:w="0" w:type="dxa"/>
-            <w:bottom w:w="0" w:type="dxa"/>
-          </w:tblCellMar>
-        </w:tblPrEx>
         <w:tc>
           <w:tcPr>
             <w:tcW w:w="1100" w:type="dxa"/>
@@ -5589,12 +5419,6 @@
         </w:tc>
       </w:tr>
       <w:tr>
-        <w:tblPrEx>
-          <w:tblCellMar>
-            <w:top w:w="0" w:type="dxa"/>
-            <w:bottom w:w="0" w:type="dxa"/>
-          </w:tblCellMar>
-        </w:tblPrEx>
         <w:tc>
           <w:tcPr>
             <w:tcW w:w="1100" w:type="dxa"/>
@@ -5754,12 +5578,6 @@
         </w:tc>
       </w:tr>
       <w:tr>
-        <w:tblPrEx>
-          <w:tblCellMar>
-            <w:top w:w="0" w:type="dxa"/>
-            <w:bottom w:w="0" w:type="dxa"/>
-          </w:tblCellMar>
-        </w:tblPrEx>
         <w:tc>
           <w:tcPr>
             <w:tcW w:w="1100" w:type="dxa"/>
@@ -5926,12 +5744,6 @@
         </w:tc>
       </w:tr>
       <w:tr>
-        <w:tblPrEx>
-          <w:tblCellMar>
-            <w:top w:w="0" w:type="dxa"/>
-            <w:bottom w:w="0" w:type="dxa"/>
-          </w:tblCellMar>
-        </w:tblPrEx>
         <w:tc>
           <w:tcPr>
             <w:tcW w:w="1100" w:type="dxa"/>
@@ -6081,12 +5893,6 @@
         </w:tc>
       </w:tr>
       <w:tr>
-        <w:tblPrEx>
-          <w:tblCellMar>
-            <w:top w:w="0" w:type="dxa"/>
-            <w:bottom w:w="0" w:type="dxa"/>
-          </w:tblCellMar>
-        </w:tblPrEx>
         <w:tc>
           <w:tcPr>
             <w:tcW w:w="1100" w:type="dxa"/>
@@ -6253,12 +6059,6 @@
         </w:tc>
       </w:tr>
       <w:tr>
-        <w:tblPrEx>
-          <w:tblCellMar>
-            <w:top w:w="0" w:type="dxa"/>
-            <w:bottom w:w="0" w:type="dxa"/>
-          </w:tblCellMar>
-        </w:tblPrEx>
         <w:tc>
           <w:tcPr>
             <w:tcW w:w="1100" w:type="dxa"/>
@@ -6437,12 +6237,6 @@
         <w:gridCol w:w="3160"/>
       </w:tblGrid>
       <w:tr>
-        <w:tblPrEx>
-          <w:tblCellMar>
-            <w:top w:w="0" w:type="dxa"/>
-            <w:bottom w:w="0" w:type="dxa"/>
-          </w:tblCellMar>
-        </w:tblPrEx>
         <w:trPr>
           <w:tblHeader/>
         </w:trPr>
@@ -6520,12 +6314,6 @@
         </w:tc>
       </w:tr>
       <w:tr>
-        <w:tblPrEx>
-          <w:tblCellMar>
-            <w:top w:w="0" w:type="dxa"/>
-            <w:bottom w:w="0" w:type="dxa"/>
-          </w:tblCellMar>
-        </w:tblPrEx>
         <w:tc>
           <w:tcPr>
             <w:tcW w:w="1000" w:type="dxa"/>
@@ -6591,12 +6379,6 @@
         </w:tc>
       </w:tr>
       <w:tr>
-        <w:tblPrEx>
-          <w:tblCellMar>
-            <w:top w:w="0" w:type="dxa"/>
-            <w:bottom w:w="0" w:type="dxa"/>
-          </w:tblCellMar>
-        </w:tblPrEx>
         <w:tc>
           <w:tcPr>
             <w:tcW w:w="1000" w:type="dxa"/>
@@ -6665,12 +6447,6 @@
         </w:tc>
       </w:tr>
       <w:tr>
-        <w:tblPrEx>
-          <w:tblCellMar>
-            <w:top w:w="0" w:type="dxa"/>
-            <w:bottom w:w="0" w:type="dxa"/>
-          </w:tblCellMar>
-        </w:tblPrEx>
         <w:tc>
           <w:tcPr>
             <w:tcW w:w="1000" w:type="dxa"/>
@@ -6791,12 +6567,6 @@
         <w:gridCol w:w="7360"/>
       </w:tblGrid>
       <w:tr>
-        <w:tblPrEx>
-          <w:tblCellMar>
-            <w:top w:w="0" w:type="dxa"/>
-            <w:bottom w:w="0" w:type="dxa"/>
-          </w:tblCellMar>
-        </w:tblPrEx>
         <w:trPr>
           <w:tblHeader/>
         </w:trPr>
@@ -6850,12 +6620,6 @@
         </w:tc>
       </w:tr>
       <w:tr>
-        <w:tblPrEx>
-          <w:tblCellMar>
-            <w:top w:w="0" w:type="dxa"/>
-            <w:bottom w:w="0" w:type="dxa"/>
-          </w:tblCellMar>
-        </w:tblPrEx>
         <w:tc>
           <w:tcPr>
             <w:tcW w:w="2000" w:type="dxa"/>
@@ -6919,12 +6683,6 @@
         </w:tc>
       </w:tr>
       <w:tr>
-        <w:tblPrEx>
-          <w:tblCellMar>
-            <w:top w:w="0" w:type="dxa"/>
-            <w:bottom w:w="0" w:type="dxa"/>
-          </w:tblCellMar>
-        </w:tblPrEx>
         <w:tc>
           <w:tcPr>
             <w:tcW w:w="2000" w:type="dxa"/>
@@ -6990,12 +6748,6 @@
         </w:tc>
       </w:tr>
       <w:tr>
-        <w:tblPrEx>
-          <w:tblCellMar>
-            <w:top w:w="0" w:type="dxa"/>
-            <w:bottom w:w="0" w:type="dxa"/>
-          </w:tblCellMar>
-        </w:tblPrEx>
         <w:tc>
           <w:tcPr>
             <w:tcW w:w="2000" w:type="dxa"/>
@@ -7041,12 +6793,6 @@
         </w:tc>
       </w:tr>
       <w:tr>
-        <w:tblPrEx>
-          <w:tblCellMar>
-            <w:top w:w="0" w:type="dxa"/>
-            <w:bottom w:w="0" w:type="dxa"/>
-          </w:tblCellMar>
-        </w:tblPrEx>
         <w:tc>
           <w:tcPr>
             <w:tcW w:w="2000" w:type="dxa"/>
@@ -7141,15 +6887,7 @@
           <w:bCs/>
           <w:color w:val="2E5496"/>
         </w:rPr>
-        <w:t xml:space="preserve">3.1 STTZZLIB.PRW — Biblioteca </w:t>
-      </w:r>
-      <w:r>
-        <w:rPr>
-          <w:b/>
-          <w:bCs/>
-          <w:color w:val="2E5496"/>
-        </w:rPr>
-        <w:t>de funções comuns</w:t>
+        <w:t>3.1 STTZZLIB.PRW — Biblioteca de funções comuns</w:t>
       </w:r>
       <w:bookmarkEnd w:id="8"/>
     </w:p>
@@ -7184,12 +6922,6 @@
         <w:gridCol w:w="5960"/>
       </w:tblGrid>
       <w:tr>
-        <w:tblPrEx>
-          <w:tblCellMar>
-            <w:top w:w="0" w:type="dxa"/>
-            <w:bottom w:w="0" w:type="dxa"/>
-          </w:tblCellMar>
-        </w:tblPrEx>
         <w:trPr>
           <w:tblHeader/>
         </w:trPr>
@@ -7243,12 +6975,6 @@
         </w:tc>
       </w:tr>
       <w:tr>
-        <w:tblPrEx>
-          <w:tblCellMar>
-            <w:top w:w="0" w:type="dxa"/>
-            <w:bottom w:w="0" w:type="dxa"/>
-          </w:tblCellMar>
-        </w:tblPrEx>
         <w:tc>
           <w:tcPr>
             <w:tcW w:w="3400" w:type="dxa"/>
@@ -7356,12 +7082,6 @@
         </w:tc>
       </w:tr>
       <w:tr>
-        <w:tblPrEx>
-          <w:tblCellMar>
-            <w:top w:w="0" w:type="dxa"/>
-            <w:bottom w:w="0" w:type="dxa"/>
-          </w:tblCellMar>
-        </w:tblPrEx>
         <w:tc>
           <w:tcPr>
             <w:tcW w:w="3400" w:type="dxa"/>
@@ -7441,12 +7161,6 @@
         </w:tc>
       </w:tr>
       <w:tr>
-        <w:tblPrEx>
-          <w:tblCellMar>
-            <w:top w:w="0" w:type="dxa"/>
-            <w:bottom w:w="0" w:type="dxa"/>
-          </w:tblCellMar>
-        </w:tblPrEx>
         <w:tc>
           <w:tcPr>
             <w:tcW w:w="3400" w:type="dxa"/>
@@ -7554,12 +7268,6 @@
         </w:tc>
       </w:tr>
       <w:tr>
-        <w:tblPrEx>
-          <w:tblCellMar>
-            <w:top w:w="0" w:type="dxa"/>
-            <w:bottom w:w="0" w:type="dxa"/>
-          </w:tblCellMar>
-        </w:tblPrEx>
         <w:tc>
           <w:tcPr>
             <w:tcW w:w="3400" w:type="dxa"/>
@@ -7648,12 +7356,6 @@
         </w:tc>
       </w:tr>
       <w:tr>
-        <w:tblPrEx>
-          <w:tblCellMar>
-            <w:top w:w="0" w:type="dxa"/>
-            <w:bottom w:w="0" w:type="dxa"/>
-          </w:tblCellMar>
-        </w:tblPrEx>
         <w:tc>
           <w:tcPr>
             <w:tcW w:w="3400" w:type="dxa"/>
@@ -7730,12 +7432,6 @@
         </w:tc>
       </w:tr>
       <w:tr>
-        <w:tblPrEx>
-          <w:tblCellMar>
-            <w:top w:w="0" w:type="dxa"/>
-            <w:bottom w:w="0" w:type="dxa"/>
-          </w:tblCellMar>
-        </w:tblPrEx>
         <w:tc>
           <w:tcPr>
             <w:tcW w:w="3400" w:type="dxa"/>
@@ -7843,12 +7539,6 @@
         </w:tc>
       </w:tr>
       <w:tr>
-        <w:tblPrEx>
-          <w:tblCellMar>
-            <w:top w:w="0" w:type="dxa"/>
-            <w:bottom w:w="0" w:type="dxa"/>
-          </w:tblCellMar>
-        </w:tblPrEx>
         <w:tc>
           <w:tcPr>
             <w:tcW w:w="3400" w:type="dxa"/>
@@ -7956,12 +7646,6 @@
         </w:tc>
       </w:tr>
       <w:tr>
-        <w:tblPrEx>
-          <w:tblCellMar>
-            <w:top w:w="0" w:type="dxa"/>
-            <w:bottom w:w="0" w:type="dxa"/>
-          </w:tblCellMar>
-        </w:tblPrEx>
         <w:tc>
           <w:tcPr>
             <w:tcW w:w="3400" w:type="dxa"/>
@@ -8092,12 +7776,6 @@
         </w:tc>
       </w:tr>
       <w:tr>
-        <w:tblPrEx>
-          <w:tblCellMar>
-            <w:top w:w="0" w:type="dxa"/>
-            <w:bottom w:w="0" w:type="dxa"/>
-          </w:tblCellMar>
-        </w:tblPrEx>
         <w:tc>
           <w:tcPr>
             <w:tcW w:w="3400" w:type="dxa"/>
@@ -8165,10 +7843,7 @@
       </w:r>
       <w:proofErr w:type="spellEnd"/>
       <w:r>
-        <w:t xml:space="preserve"> (os métodos ch</w:t>
-      </w:r>
-      <w:r>
-        <w:t>amam a mesma biblioteca):</w:t>
+        <w:t xml:space="preserve"> (os métodos chamam a mesma biblioteca):</w:t>
       </w:r>
     </w:p>
     <w:p>
@@ -8456,10 +8131,7 @@
         <w:spacing w:after="60"/>
       </w:pPr>
       <w:r>
-        <w:t>Legenda: Vermelho (certificado</w:t>
-      </w:r>
-      <w:r>
-        <w:t xml:space="preserve"> vencido, ZZ1_VALCER &lt; </w:t>
+        <w:t xml:space="preserve">Legenda: Vermelho (certificado vencido, ZZ1_VALCER &lt; </w:t>
       </w:r>
       <w:proofErr w:type="spellStart"/>
       <w:r>
@@ -8501,10 +8173,7 @@
       </w:r>
       <w:proofErr w:type="spellEnd"/>
       <w:r>
-        <w:t xml:space="preserve"> (tratam</w:t>
-      </w:r>
-      <w:r>
-        <w:t>ento de erros).</w:t>
+        <w:t xml:space="preserve"> (tratamento de erros).</w:t>
       </w:r>
     </w:p>
     <w:p>
@@ -8586,10 +8255,7 @@
         <w:spacing w:after="60"/>
       </w:pPr>
       <w:r>
-        <w:t>Legenda (diferencial): Vermelho quando %NC &gt; tolerância do certificado da ZZ1; Verde caso contrár</w:t>
-      </w:r>
-      <w:r>
-        <w:t>io.</w:t>
+        <w:t>Legenda (diferencial): Vermelho quando %NC &gt; tolerância do certificado da ZZ1; Verde caso contrário.</w:t>
       </w:r>
     </w:p>
     <w:p>
@@ -8656,17 +8322,7 @@
           <w:sz w:val="30"/>
           <w:szCs w:val="30"/>
         </w:rPr>
-        <w:t>4. Ga</w:t>
-      </w:r>
-      <w:r>
-        <w:rPr>
-          <w:b/>
-          <w:bCs/>
-          <w:color w:val="1F3864"/>
-          <w:sz w:val="30"/>
-          <w:szCs w:val="30"/>
-        </w:rPr>
-        <w:t>tilhos Configurados (SX7)</w:t>
+        <w:t>4. Gatilhos Configurados (SX7)</w:t>
       </w:r>
       <w:bookmarkEnd w:id="11"/>
     </w:p>
@@ -8676,10 +8332,7 @@
         <w:jc w:val="both"/>
       </w:pPr>
       <w:r>
-        <w:t>Os gatilhos preenchem automaticamente campos dependentes na digitação, todos na fase 3 (após validação do campo de origem). Eles trazem o nome do fornecedor, herdam fornecedor/loja a partir do controle e assumem data/hora atuais n</w:t>
-      </w:r>
-      <w:r>
-        <w:t>a inclusão.</w:t>
+        <w:t>Os gatilhos preenchem automaticamente campos dependentes na digitação, todos na fase 3 (após validação do campo de origem). Eles trazem o nome do fornecedor, herdam fornecedor/loja a partir do controle e assumem data/hora atuais na inclusão.</w:t>
       </w:r>
     </w:p>
     <w:tbl>
@@ -8706,12 +8359,6 @@
         <w:gridCol w:w="1183"/>
       </w:tblGrid>
       <w:tr>
-        <w:tblPrEx>
-          <w:tblCellMar>
-            <w:top w:w="0" w:type="dxa"/>
-            <w:bottom w:w="0" w:type="dxa"/>
-          </w:tblCellMar>
-        </w:tblPrEx>
         <w:trPr>
           <w:tblHeader/>
         </w:trPr>
@@ -8814,12 +8461,6 @@
         </w:tc>
       </w:tr>
       <w:tr>
-        <w:tblPrEx>
-          <w:tblCellMar>
-            <w:top w:w="0" w:type="dxa"/>
-            <w:bottom w:w="0" w:type="dxa"/>
-          </w:tblCellMar>
-        </w:tblPrEx>
         <w:tc>
           <w:tcPr>
             <w:tcW w:w="1700" w:type="dxa"/>
@@ -8925,12 +8566,6 @@
         </w:tc>
       </w:tr>
       <w:tr>
-        <w:tblPrEx>
-          <w:tblCellMar>
-            <w:top w:w="0" w:type="dxa"/>
-            <w:bottom w:w="0" w:type="dxa"/>
-          </w:tblCellMar>
-        </w:tblPrEx>
         <w:tc>
           <w:tcPr>
             <w:tcW w:w="1700" w:type="dxa"/>
@@ -9040,12 +8675,6 @@
         </w:tc>
       </w:tr>
       <w:tr>
-        <w:tblPrEx>
-          <w:tblCellMar>
-            <w:top w:w="0" w:type="dxa"/>
-            <w:bottom w:w="0" w:type="dxa"/>
-          </w:tblCellMar>
-        </w:tblPrEx>
         <w:tc>
           <w:tcPr>
             <w:tcW w:w="1700" w:type="dxa"/>
@@ -9151,12 +8780,6 @@
         </w:tc>
       </w:tr>
       <w:tr>
-        <w:tblPrEx>
-          <w:tblCellMar>
-            <w:top w:w="0" w:type="dxa"/>
-            <w:bottom w:w="0" w:type="dxa"/>
-          </w:tblCellMar>
-        </w:tblPrEx>
         <w:tc>
           <w:tcPr>
             <w:tcW w:w="1700" w:type="dxa"/>
@@ -9266,12 +8889,6 @@
         </w:tc>
       </w:tr>
       <w:tr>
-        <w:tblPrEx>
-          <w:tblCellMar>
-            <w:top w:w="0" w:type="dxa"/>
-            <w:bottom w:w="0" w:type="dxa"/>
-          </w:tblCellMar>
-        </w:tblPrEx>
         <w:tc>
           <w:tcPr>
             <w:tcW w:w="1700" w:type="dxa"/>
@@ -9387,12 +9004,6 @@
         </w:tc>
       </w:tr>
       <w:tr>
-        <w:tblPrEx>
-          <w:tblCellMar>
-            <w:top w:w="0" w:type="dxa"/>
-            <w:bottom w:w="0" w:type="dxa"/>
-          </w:tblCellMar>
-        </w:tblPrEx>
         <w:tc>
           <w:tcPr>
             <w:tcW w:w="1700" w:type="dxa"/>
@@ -9567,12 +9178,6 @@
         <w:gridCol w:w="6160"/>
       </w:tblGrid>
       <w:tr>
-        <w:tblPrEx>
-          <w:tblCellMar>
-            <w:top w:w="0" w:type="dxa"/>
-            <w:bottom w:w="0" w:type="dxa"/>
-          </w:tblCellMar>
-        </w:tblPrEx>
         <w:trPr>
           <w:tblHeader/>
         </w:trPr>
@@ -9626,12 +9231,6 @@
         </w:tc>
       </w:tr>
       <w:tr>
-        <w:tblPrEx>
-          <w:tblCellMar>
-            <w:top w:w="0" w:type="dxa"/>
-            <w:bottom w:w="0" w:type="dxa"/>
-          </w:tblCellMar>
-        </w:tblPrEx>
         <w:tc>
           <w:tcPr>
             <w:tcW w:w="3200" w:type="dxa"/>
@@ -9715,12 +9314,6 @@
         </w:tc>
       </w:tr>
       <w:tr>
-        <w:tblPrEx>
-          <w:tblCellMar>
-            <w:top w:w="0" w:type="dxa"/>
-            <w:bottom w:w="0" w:type="dxa"/>
-          </w:tblCellMar>
-        </w:tblPrEx>
         <w:tc>
           <w:tcPr>
             <w:tcW w:w="3200" w:type="dxa"/>
@@ -9796,12 +9389,6 @@
         </w:tc>
       </w:tr>
       <w:tr>
-        <w:tblPrEx>
-          <w:tblCellMar>
-            <w:top w:w="0" w:type="dxa"/>
-            <w:bottom w:w="0" w:type="dxa"/>
-          </w:tblCellMar>
-        </w:tblPrEx>
         <w:tc>
           <w:tcPr>
             <w:tcW w:w="3200" w:type="dxa"/>
@@ -9865,12 +9452,6 @@
         </w:tc>
       </w:tr>
       <w:tr>
-        <w:tblPrEx>
-          <w:tblCellMar>
-            <w:top w:w="0" w:type="dxa"/>
-            <w:bottom w:w="0" w:type="dxa"/>
-          </w:tblCellMar>
-        </w:tblPrEx>
         <w:tc>
           <w:tcPr>
             <w:tcW w:w="3200" w:type="dxa"/>
@@ -9956,12 +9537,6 @@
         <w:gridCol w:w="6160"/>
       </w:tblGrid>
       <w:tr>
-        <w:tblPrEx>
-          <w:tblCellMar>
-            <w:top w:w="0" w:type="dxa"/>
-            <w:bottom w:w="0" w:type="dxa"/>
-          </w:tblCellMar>
-        </w:tblPrEx>
         <w:trPr>
           <w:tblHeader/>
         </w:trPr>
@@ -10015,12 +9590,6 @@
         </w:tc>
       </w:tr>
       <w:tr>
-        <w:tblPrEx>
-          <w:tblCellMar>
-            <w:top w:w="0" w:type="dxa"/>
-            <w:bottom w:w="0" w:type="dxa"/>
-          </w:tblCellMar>
-        </w:tblPrEx>
         <w:tc>
           <w:tcPr>
             <w:tcW w:w="3200" w:type="dxa"/>
@@ -10104,12 +9673,6 @@
         </w:tc>
       </w:tr>
       <w:tr>
-        <w:tblPrEx>
-          <w:tblCellMar>
-            <w:top w:w="0" w:type="dxa"/>
-            <w:bottom w:w="0" w:type="dxa"/>
-          </w:tblCellMar>
-        </w:tblPrEx>
         <w:tc>
           <w:tcPr>
             <w:tcW w:w="3200" w:type="dxa"/>
@@ -10195,12 +9758,6 @@
         </w:tc>
       </w:tr>
       <w:tr>
-        <w:tblPrEx>
-          <w:tblCellMar>
-            <w:top w:w="0" w:type="dxa"/>
-            <w:bottom w:w="0" w:type="dxa"/>
-          </w:tblCellMar>
-        </w:tblPrEx>
         <w:tc>
           <w:tcPr>
             <w:tcW w:w="3200" w:type="dxa"/>
@@ -10256,12 +9813,6 @@
         </w:tc>
       </w:tr>
       <w:tr>
-        <w:tblPrEx>
-          <w:tblCellMar>
-            <w:top w:w="0" w:type="dxa"/>
-            <w:bottom w:w="0" w:type="dxa"/>
-          </w:tblCellMar>
-        </w:tblPrEx>
         <w:tc>
           <w:tcPr>
             <w:tcW w:w="3200" w:type="dxa"/>
@@ -10754,15 +10305,7 @@
           <w:sz w:val="18"/>
           <w:szCs w:val="18"/>
         </w:rPr>
-        <w:t xml:space="preserve">     </w:t>
-      </w:r>
-      <w:r>
-        <w:rPr>
-          <w:rFonts w:ascii="Consolas" w:eastAsia="Consolas" w:hAnsi="Consolas" w:cs="Consolas"/>
-          <w:sz w:val="18"/>
-          <w:szCs w:val="18"/>
-        </w:rPr>
-        <w:t xml:space="preserve">           BEGIN TRANSACTION</w:t>
+        <w:t xml:space="preserve">                BEGIN TRANSACTION</w:t>
       </w:r>
     </w:p>
     <w:p>
@@ -11115,10 +10658,7 @@
       </w:r>
       <w:proofErr w:type="spellEnd"/>
       <w:r>
-        <w:t xml:space="preserve"> pelo Conf</w:t>
-      </w:r>
-      <w:r>
-        <w:t>igurador (Base de Dados &gt; Dicionário) ou digite as entradas manualmente, na seguinte ordem:</w:t>
+        <w:t xml:space="preserve"> pelo Configurador (Base de Dados &gt; Dicionário) ou digite as entradas manualmente, na seguinte ordem:</w:t>
       </w:r>
     </w:p>
     <w:p>
@@ -11144,10 +10684,7 @@
         <w:spacing w:after="60"/>
       </w:pPr>
       <w:r>
-        <w:t>SX3 (campos): cadastra os campos com títulos, tipos, validações (X3_VALID) e relações dos virtu</w:t>
-      </w:r>
-      <w:r>
-        <w:t>ais (X3_RELACAO).</w:t>
+        <w:t>SX3 (campos): cadastra os campos com títulos, tipos, validações (X3_VALID) e relações dos virtuais (X3_RELACAO).</w:t>
       </w:r>
     </w:p>
     <w:p>
@@ -11195,10 +10732,7 @@
         <w:jc w:val="both"/>
       </w:pPr>
       <w:r>
-        <w:t>Em seguida, gere/atualize as tabelas físicas ZZ1990 e ZZ2990 pelo u</w:t>
-      </w:r>
-      <w:r>
-        <w:t>tilitário de atualização de dicionário/base.</w:t>
+        <w:t>Em seguida, gere/atualize as tabelas físicas ZZ1990 e ZZ2990 pelo utilitário de atualização de dicionário/base.</w:t>
       </w:r>
     </w:p>
     <w:p>
@@ -11280,123 +10814,128 @@
           <w:sz w:val="18"/>
           <w:szCs w:val="18"/>
         </w:rPr>
-        <w:t>biblioteca + classe ZF</w:t>
-      </w:r>
+        <w:t>biblioteca + classe ZFORNISO)</w:t>
+      </w:r>
+    </w:p>
+    <w:p>
+      <w:pPr>
+        <w:shd w:val="clear" w:color="auto" w:fill="F2F2F2"/>
+      </w:pPr>
       <w:r>
         <w:rPr>
           <w:rFonts w:ascii="Consolas" w:eastAsia="Consolas" w:hAnsi="Consolas" w:cs="Consolas"/>
           <w:sz w:val="18"/>
           <w:szCs w:val="18"/>
         </w:rPr>
-        <w:t>ORNISO)</w:t>
-      </w:r>
-    </w:p>
-    <w:p>
-      <w:pPr>
-        <w:shd w:val="clear" w:color="auto" w:fill="F2F2F2"/>
-      </w:pPr>
+        <w:t xml:space="preserve">2) STTZZ1.PRW  </w:t>
+      </w:r>
+      <w:proofErr w:type="gramStart"/>
       <w:r>
         <w:rPr>
           <w:rFonts w:ascii="Consolas" w:eastAsia="Consolas" w:hAnsi="Consolas" w:cs="Consolas"/>
           <w:sz w:val="18"/>
           <w:szCs w:val="18"/>
         </w:rPr>
-        <w:t xml:space="preserve">2) STTZZ1.PRW  </w:t>
-      </w:r>
-      <w:proofErr w:type="gramStart"/>
+        <w:t xml:space="preserve">   (</w:t>
+      </w:r>
+      <w:proofErr w:type="spellStart"/>
+      <w:proofErr w:type="gramEnd"/>
       <w:r>
         <w:rPr>
           <w:rFonts w:ascii="Consolas" w:eastAsia="Consolas" w:hAnsi="Consolas" w:cs="Consolas"/>
           <w:sz w:val="18"/>
           <w:szCs w:val="18"/>
         </w:rPr>
-        <w:t xml:space="preserve">   (</w:t>
-      </w:r>
-      <w:proofErr w:type="spellStart"/>
-      <w:proofErr w:type="gramEnd"/>
+        <w:t>mBrowse</w:t>
+      </w:r>
+      <w:proofErr w:type="spellEnd"/>
       <w:r>
         <w:rPr>
           <w:rFonts w:ascii="Consolas" w:eastAsia="Consolas" w:hAnsi="Consolas" w:cs="Consolas"/>
           <w:sz w:val="18"/>
           <w:szCs w:val="18"/>
         </w:rPr>
-        <w:t>mBrowse</w:t>
-      </w:r>
-      <w:proofErr w:type="spellEnd"/>
+        <w:t xml:space="preserve"> da ZZ1)</w:t>
+      </w:r>
+    </w:p>
+    <w:p>
+      <w:pPr>
+        <w:shd w:val="clear" w:color="auto" w:fill="F2F2F2"/>
+        <w:spacing w:after="120"/>
+      </w:pPr>
       <w:r>
         <w:rPr>
           <w:rFonts w:ascii="Consolas" w:eastAsia="Consolas" w:hAnsi="Consolas" w:cs="Consolas"/>
           <w:sz w:val="18"/>
           <w:szCs w:val="18"/>
         </w:rPr>
-        <w:t xml:space="preserve"> da ZZ1)</w:t>
-      </w:r>
-    </w:p>
-    <w:p>
-      <w:pPr>
-        <w:shd w:val="clear" w:color="auto" w:fill="F2F2F2"/>
-        <w:spacing w:after="120"/>
-      </w:pPr>
+        <w:t xml:space="preserve">3) STTZZ2.PRW  </w:t>
+      </w:r>
+      <w:proofErr w:type="gramStart"/>
       <w:r>
         <w:rPr>
           <w:rFonts w:ascii="Consolas" w:eastAsia="Consolas" w:hAnsi="Consolas" w:cs="Consolas"/>
           <w:sz w:val="18"/>
           <w:szCs w:val="18"/>
         </w:rPr>
-        <w:t xml:space="preserve">3) STTZZ2.PRW  </w:t>
-      </w:r>
-      <w:proofErr w:type="gramStart"/>
+        <w:t xml:space="preserve">   (</w:t>
+      </w:r>
+      <w:proofErr w:type="spellStart"/>
+      <w:proofErr w:type="gramEnd"/>
       <w:r>
         <w:rPr>
           <w:rFonts w:ascii="Consolas" w:eastAsia="Consolas" w:hAnsi="Consolas" w:cs="Consolas"/>
           <w:sz w:val="18"/>
           <w:szCs w:val="18"/>
         </w:rPr>
-        <w:t xml:space="preserve">   (</w:t>
-      </w:r>
-      <w:proofErr w:type="spellStart"/>
-      <w:proofErr w:type="gramEnd"/>
+        <w:t>mBrowse</w:t>
+      </w:r>
+      <w:proofErr w:type="spellEnd"/>
       <w:r>
         <w:rPr>
           <w:rFonts w:ascii="Consolas" w:eastAsia="Consolas" w:hAnsi="Consolas" w:cs="Consolas"/>
           <w:sz w:val="18"/>
           <w:szCs w:val="18"/>
         </w:rPr>
-        <w:t>mBrowse</w:t>
-      </w:r>
-      <w:proofErr w:type="spellEnd"/>
+        <w:t xml:space="preserve"> da ZZ2)</w:t>
+      </w:r>
+    </w:p>
+    <w:p>
+      <w:pPr>
+        <w:pStyle w:val="Ttulo2"/>
+        <w:spacing w:before="200" w:after="100"/>
+      </w:pPr>
+      <w:bookmarkStart w:id="19" w:name="_Toc236955556"/>
+      <w:r>
+        <w:rPr>
+          <w:b/>
+          <w:bCs/>
+          <w:color w:val="2E5496"/>
+        </w:rPr>
+        <w:t>7.3 Cadastrar o menu (SIGACOM)</w:t>
+      </w:r>
+      <w:bookmarkEnd w:id="19"/>
+    </w:p>
+    <w:p>
+      <w:pPr>
+        <w:spacing w:after="120" w:line="276" w:lineRule="auto"/>
+        <w:jc w:val="both"/>
+      </w:pPr>
+      <w:r>
+        <w:t>No Configurador, em Ambiente &gt; Menus, replique a árvore abaixo apontando as funções de usuário:</w:t>
+      </w:r>
+    </w:p>
+    <w:p>
+      <w:pPr>
+        <w:shd w:val="clear" w:color="auto" w:fill="F2F2F2"/>
+      </w:pPr>
       <w:r>
         <w:rPr>
           <w:rFonts w:ascii="Consolas" w:eastAsia="Consolas" w:hAnsi="Consolas" w:cs="Consolas"/>
           <w:sz w:val="18"/>
           <w:szCs w:val="18"/>
         </w:rPr>
-        <w:t xml:space="preserve"> da ZZ2)</w:t>
-      </w:r>
-    </w:p>
-    <w:p>
-      <w:pPr>
-        <w:pStyle w:val="Ttulo2"/>
-        <w:spacing w:before="200" w:after="100"/>
-      </w:pPr>
-      <w:bookmarkStart w:id="19" w:name="_Toc236955556"/>
-      <w:r>
-        <w:rPr>
-          <w:b/>
-          <w:bCs/>
-          <w:color w:val="2E5496"/>
-        </w:rPr>
-        <w:t>7.3 Cadastrar o menu (SIGACOM)</w:t>
-      </w:r>
-      <w:bookmarkEnd w:id="19"/>
-    </w:p>
-    <w:p>
-      <w:pPr>
-        <w:spacing w:after="120" w:line="276" w:lineRule="auto"/>
-        <w:jc w:val="both"/>
-      </w:pPr>
-      <w:r>
-        <w:t>No Configurador, em Ambiente &gt; Menus, replique a árvore abaixo apontando as funções de usuário:</w:t>
+        <w:t>Cadastros</w:t>
       </w:r>
     </w:p>
     <w:p>
@@ -11409,7 +10948,7 @@
           <w:sz w:val="18"/>
           <w:szCs w:val="18"/>
         </w:rPr>
-        <w:t>Cadastros</w:t>
+        <w:t xml:space="preserve"> └── Controle ISO 9001</w:t>
       </w:r>
     </w:p>
     <w:p>
@@ -11422,28 +10961,7 @@
           <w:sz w:val="18"/>
           <w:szCs w:val="18"/>
         </w:rPr>
-        <w:t xml:space="preserve"> └── Controle ISO 9001</w:t>
-      </w:r>
-    </w:p>
-    <w:p>
-      <w:pPr>
-        <w:shd w:val="clear" w:color="auto" w:fill="F2F2F2"/>
-      </w:pPr>
-      <w:r>
-        <w:rPr>
-          <w:rFonts w:ascii="Consolas" w:eastAsia="Consolas" w:hAnsi="Consolas" w:cs="Consolas"/>
-          <w:sz w:val="18"/>
-          <w:szCs w:val="18"/>
-        </w:rPr>
-        <w:t xml:space="preserve">     ├── Controle </w:t>
-      </w:r>
-      <w:r>
-        <w:rPr>
-          <w:rFonts w:ascii="Consolas" w:eastAsia="Consolas" w:hAnsi="Consolas" w:cs="Consolas"/>
-          <w:sz w:val="18"/>
-          <w:szCs w:val="18"/>
-        </w:rPr>
-        <w:t>de Fornecimento (ZZ1)    → U_STTZZ1</w:t>
+        <w:t xml:space="preserve">     ├── Controle de Fornecimento (ZZ1)    → U_STTZZ1</w:t>
       </w:r>
     </w:p>
     <w:p>
@@ -11509,10 +11027,16 @@
         <w:jc w:val="both"/>
       </w:pPr>
       <w:r>
-        <w:t>Sem acesso ao ambiente P</w:t>
-      </w:r>
-      <w:r>
-        <w:t xml:space="preserve">rotheus, as telas são representadas pelos protótipos textuais abaixo, que reproduzem o comportamento esperado (as legendas coloridas aparecem como bolinhas no canto esquerdo de cada linha do </w:t>
+        <w:t xml:space="preserve">No ambiente </w:t>
+      </w:r>
+      <w:r>
+        <w:t>Protheus, as telas são representadas pelos protótipos</w:t>
+      </w:r>
+      <w:r>
+        <w:t xml:space="preserve"> </w:t>
+      </w:r>
+      <w:r>
+        <w:t xml:space="preserve">abaixo, que reproduzem o comportamento esperado (as legendas coloridas aparecem como bolinhas no canto esquerdo de cada linha do </w:t>
       </w:r>
       <w:proofErr w:type="spellStart"/>
       <w:r>
@@ -11520,14 +11044,12 @@
       </w:r>
       <w:proofErr w:type="spellEnd"/>
       <w:r>
-        <w:t>). Os prints reais podem ser anexados nesta seção.</w:t>
+        <w:t>).</w:t>
       </w:r>
     </w:p>
     <w:p>
       <w:pPr>
         <w:spacing w:before="120" w:after="40"/>
-      </w:pPr>
-      <w:r>
         <w:rPr>
           <w:b/>
           <w:bCs/>
@@ -11535,9 +11057,7 @@
           <w:sz w:val="20"/>
           <w:szCs w:val="20"/>
         </w:rPr>
-        <w:t xml:space="preserve">8.1 </w:t>
-      </w:r>
-      <w:proofErr w:type="spellStart"/>
+      </w:pPr>
       <w:r>
         <w:rPr>
           <w:b/>
@@ -11546,8 +11066,9 @@
           <w:sz w:val="20"/>
           <w:szCs w:val="20"/>
         </w:rPr>
-        <w:t>Brow</w:t>
-      </w:r>
+        <w:t xml:space="preserve">8.1 </w:t>
+      </w:r>
+      <w:proofErr w:type="spellStart"/>
       <w:r>
         <w:rPr>
           <w:b/>
@@ -11556,7 +11077,7 @@
           <w:sz w:val="20"/>
           <w:szCs w:val="20"/>
         </w:rPr>
-        <w:t>se</w:t>
+        <w:t>Browse</w:t>
       </w:r>
       <w:proofErr w:type="spellEnd"/>
       <w:r>
@@ -11572,242 +11093,7 @@
     </w:p>
     <w:p>
       <w:pPr>
-        <w:shd w:val="clear" w:color="auto" w:fill="F2F2F2"/>
-      </w:pPr>
-      <w:r>
-        <w:rPr>
-          <w:rFonts w:ascii="Consolas" w:eastAsia="Consolas" w:hAnsi="Consolas" w:cs="Consolas"/>
-          <w:sz w:val="18"/>
-          <w:szCs w:val="18"/>
-        </w:rPr>
-        <w:t>Controle de Fornecimento (ISO 9001)</w:t>
-      </w:r>
-    </w:p>
-    <w:p>
-      <w:pPr>
-        <w:shd w:val="clear" w:color="auto" w:fill="F2F2F2"/>
-      </w:pPr>
-      <w:r>
-        <w:rPr>
-          <w:rFonts w:ascii="Consolas" w:eastAsia="Consolas" w:hAnsi="Consolas" w:cs="Consolas"/>
-          <w:sz w:val="18"/>
-          <w:szCs w:val="18"/>
-        </w:rPr>
-        <w:t xml:space="preserve">[Pesquisar] </w:t>
-      </w:r>
-      <w:proofErr w:type="gramStart"/>
-      <w:r>
-        <w:rPr>
-          <w:rFonts w:ascii="Consolas" w:eastAsia="Consolas" w:hAnsi="Consolas" w:cs="Consolas"/>
-          <w:sz w:val="18"/>
-          <w:szCs w:val="18"/>
-        </w:rPr>
-        <w:t>[Visualizar</w:t>
-      </w:r>
-      <w:proofErr w:type="gramEnd"/>
-      <w:r>
-        <w:rPr>
-          <w:rFonts w:ascii="Consolas" w:eastAsia="Consolas" w:hAnsi="Consolas" w:cs="Consolas"/>
-          <w:sz w:val="18"/>
-          <w:szCs w:val="18"/>
-        </w:rPr>
-        <w:t>] [Incluir] [Alterar] [Excluir] [</w:t>
-      </w:r>
-      <w:proofErr w:type="spellStart"/>
-      <w:r>
-        <w:rPr>
-          <w:rFonts w:ascii="Consolas" w:eastAsia="Consolas" w:hAnsi="Consolas" w:cs="Consolas"/>
-          <w:sz w:val="18"/>
-          <w:szCs w:val="18"/>
-        </w:rPr>
-        <w:t>Ocorrencias</w:t>
-      </w:r>
-      <w:proofErr w:type="spellEnd"/>
-      <w:r>
-        <w:rPr>
-          <w:rFonts w:ascii="Consolas" w:eastAsia="Consolas" w:hAnsi="Consolas" w:cs="Consolas"/>
-          <w:sz w:val="18"/>
-          <w:szCs w:val="18"/>
-        </w:rPr>
-        <w:t>]</w:t>
-      </w:r>
-    </w:p>
-    <w:p>
-      <w:pPr>
-        <w:shd w:val="clear" w:color="auto" w:fill="F2F2F2"/>
-      </w:pPr>
-      <w:r>
-        <w:rPr>
-          <w:rFonts w:ascii="Consolas" w:eastAsia="Consolas" w:hAnsi="Consolas" w:cs="Consolas"/>
-          <w:sz w:val="18"/>
-          <w:szCs w:val="18"/>
-        </w:rPr>
-        <w:t xml:space="preserve"> </w:t>
-      </w:r>
-      <w:proofErr w:type="spellStart"/>
-      <w:proofErr w:type="gramStart"/>
-      <w:r>
-        <w:rPr>
-          <w:rFonts w:ascii="Consolas" w:eastAsia="Consolas" w:hAnsi="Consolas" w:cs="Consolas"/>
-          <w:sz w:val="18"/>
-          <w:szCs w:val="18"/>
-        </w:rPr>
-        <w:t>Leg</w:t>
-      </w:r>
-      <w:proofErr w:type="spellEnd"/>
-      <w:r>
-        <w:rPr>
-          <w:rFonts w:ascii="Consolas" w:eastAsia="Consolas" w:hAnsi="Consolas" w:cs="Consolas"/>
-          <w:sz w:val="18"/>
-          <w:szCs w:val="18"/>
-        </w:rPr>
-        <w:t xml:space="preserve">  </w:t>
-      </w:r>
-      <w:proofErr w:type="spellStart"/>
-      <w:r>
-        <w:rPr>
-          <w:rFonts w:ascii="Consolas" w:eastAsia="Consolas" w:hAnsi="Consolas" w:cs="Consolas"/>
-          <w:sz w:val="18"/>
-          <w:szCs w:val="18"/>
-        </w:rPr>
-        <w:t>Codigo</w:t>
-      </w:r>
-      <w:proofErr w:type="spellEnd"/>
-      <w:proofErr w:type="gramEnd"/>
-      <w:r>
-        <w:rPr>
-          <w:rFonts w:ascii="Consolas" w:eastAsia="Consolas" w:hAnsi="Consolas" w:cs="Consolas"/>
-          <w:sz w:val="18"/>
-          <w:szCs w:val="18"/>
-        </w:rPr>
-        <w:t xml:space="preserve">  Nome Fornecedor            Validade    </w:t>
-      </w:r>
-      <w:proofErr w:type="spellStart"/>
-      <w:r>
-        <w:rPr>
-          <w:rFonts w:ascii="Consolas" w:eastAsia="Consolas" w:hAnsi="Consolas" w:cs="Consolas"/>
-          <w:sz w:val="18"/>
-          <w:szCs w:val="18"/>
-        </w:rPr>
-        <w:t>Tol</w:t>
-      </w:r>
-      <w:proofErr w:type="spellEnd"/>
-      <w:r>
-        <w:rPr>
-          <w:rFonts w:ascii="Consolas" w:eastAsia="Consolas" w:hAnsi="Consolas" w:cs="Consolas"/>
-          <w:sz w:val="18"/>
-          <w:szCs w:val="18"/>
-        </w:rPr>
-        <w:t>%</w:t>
-      </w:r>
-    </w:p>
-    <w:p>
-      <w:pPr>
-        <w:shd w:val="clear" w:color="auto" w:fill="F2F2F2"/>
-      </w:pPr>
-      <w:r>
-        <w:rPr>
-          <w:rFonts w:ascii="Consolas" w:eastAsia="Consolas" w:hAnsi="Consolas" w:cs="Consolas"/>
-          <w:sz w:val="18"/>
-          <w:szCs w:val="18"/>
-        </w:rPr>
-        <w:t xml:space="preserve"> (o)  </w:t>
-      </w:r>
-      <w:proofErr w:type="gramStart"/>
-      <w:r>
-        <w:rPr>
-          <w:rFonts w:ascii="Consolas" w:eastAsia="Consolas" w:hAnsi="Consolas" w:cs="Consolas"/>
-          <w:sz w:val="18"/>
-          <w:szCs w:val="18"/>
-        </w:rPr>
-        <w:t>000001  METALURGICA</w:t>
-      </w:r>
-      <w:proofErr w:type="gramEnd"/>
-      <w:r>
-        <w:rPr>
-          <w:rFonts w:ascii="Consolas" w:eastAsia="Consolas" w:hAnsi="Consolas" w:cs="Consolas"/>
-          <w:sz w:val="18"/>
-          <w:szCs w:val="18"/>
-        </w:rPr>
-        <w:t xml:space="preserve"> ACO </w:t>
-      </w:r>
-      <w:r>
-        <w:rPr>
-          <w:rFonts w:ascii="Consolas" w:eastAsia="Consolas" w:hAnsi="Consolas" w:cs="Consolas"/>
-          <w:sz w:val="18"/>
-          <w:szCs w:val="18"/>
-        </w:rPr>
-        <w:t>FORTE LTD  20/01/2025  5,00   &lt;- Vermelho (vencido)</w:t>
-      </w:r>
-    </w:p>
-    <w:p>
-      <w:pPr>
-        <w:shd w:val="clear" w:color="auto" w:fill="F2F2F2"/>
-      </w:pPr>
-      <w:r>
-        <w:rPr>
-          <w:rFonts w:ascii="Consolas" w:eastAsia="Consolas" w:hAnsi="Consolas" w:cs="Consolas"/>
-          <w:sz w:val="18"/>
-          <w:szCs w:val="18"/>
-        </w:rPr>
-        <w:t xml:space="preserve"> (o)  </w:t>
-      </w:r>
-      <w:proofErr w:type="gramStart"/>
-      <w:r>
-        <w:rPr>
-          <w:rFonts w:ascii="Consolas" w:eastAsia="Consolas" w:hAnsi="Consolas" w:cs="Consolas"/>
-          <w:sz w:val="18"/>
-          <w:szCs w:val="18"/>
-        </w:rPr>
-        <w:t>000002  POLIMEROS</w:t>
-      </w:r>
-      <w:proofErr w:type="gramEnd"/>
-      <w:r>
-        <w:rPr>
-          <w:rFonts w:ascii="Consolas" w:eastAsia="Consolas" w:hAnsi="Consolas" w:cs="Consolas"/>
-          <w:sz w:val="18"/>
-          <w:szCs w:val="18"/>
-        </w:rPr>
-        <w:t xml:space="preserve"> DO BRASIL SA     [hoje+15]   3,00   &lt;- Amarelo (30 dias)</w:t>
-      </w:r>
-    </w:p>
-    <w:p>
-      <w:pPr>
-        <w:shd w:val="clear" w:color="auto" w:fill="F2F2F2"/>
-        <w:spacing w:after="120"/>
-      </w:pPr>
-      <w:r>
-        <w:rPr>
-          <w:rFonts w:ascii="Consolas" w:eastAsia="Consolas" w:hAnsi="Consolas" w:cs="Consolas"/>
-          <w:sz w:val="18"/>
-          <w:szCs w:val="18"/>
-        </w:rPr>
-        <w:t xml:space="preserve"> (o)  </w:t>
-      </w:r>
-      <w:proofErr w:type="gramStart"/>
-      <w:r>
-        <w:rPr>
-          <w:rFonts w:ascii="Consolas" w:eastAsia="Consolas" w:hAnsi="Consolas" w:cs="Consolas"/>
-          <w:sz w:val="18"/>
-          <w:szCs w:val="18"/>
-        </w:rPr>
-        <w:t>000003  PARAFUSOS</w:t>
-      </w:r>
-      <w:proofErr w:type="gramEnd"/>
-      <w:r>
-        <w:rPr>
-          <w:rFonts w:ascii="Consolas" w:eastAsia="Consolas" w:hAnsi="Consolas" w:cs="Consolas"/>
-          <w:sz w:val="18"/>
-          <w:szCs w:val="18"/>
-        </w:rPr>
-        <w:t xml:space="preserve"> PRECISAO ME      [hoje+180]  2,00   &lt;- Verde (ok)</w:t>
-      </w:r>
-    </w:p>
-    <w:p>
-      <w:pPr>
         <w:spacing w:before="120" w:after="40"/>
-      </w:pPr>
-      <w:r>
         <w:rPr>
           <w:b/>
           <w:bCs/>
@@ -11815,10 +11101,71 @@
           <w:sz w:val="20"/>
           <w:szCs w:val="20"/>
         </w:rPr>
-        <w:t xml:space="preserve">8.2 </w:t>
-      </w:r>
-      <w:proofErr w:type="spellStart"/>
-      <w:r>
+      </w:pPr>
+      <w:r>
+        <w:rPr>
+          <w:noProof/>
+        </w:rPr>
+        <w:drawing>
+          <wp:anchor distT="0" distB="0" distL="114300" distR="114300" simplePos="0" relativeHeight="251658240" behindDoc="0" locked="0" layoutInCell="1" allowOverlap="1" wp14:anchorId="1EB71966" wp14:editId="2D47D4D6">
+            <wp:simplePos x="0" y="0"/>
+            <wp:positionH relativeFrom="margin">
+              <wp:posOffset>-31806</wp:posOffset>
+            </wp:positionH>
+            <wp:positionV relativeFrom="paragraph">
+              <wp:posOffset>60408</wp:posOffset>
+            </wp:positionV>
+            <wp:extent cx="6269735" cy="1868556"/>
+            <wp:effectExtent l="0" t="0" r="0" b="0"/>
+            <wp:wrapNone/>
+            <wp:docPr id="1" name="Imagem 1"/>
+            <wp:cNvGraphicFramePr>
+              <a:graphicFrameLocks xmlns:a="http://schemas.openxmlformats.org/drawingml/2006/main" noChangeAspect="1"/>
+            </wp:cNvGraphicFramePr>
+            <a:graphic xmlns:a="http://schemas.openxmlformats.org/drawingml/2006/main">
+              <a:graphicData uri="http://schemas.openxmlformats.org/drawingml/2006/picture">
+                <pic:pic xmlns:pic="http://schemas.openxmlformats.org/drawingml/2006/picture">
+                  <pic:nvPicPr>
+                    <pic:cNvPr id="1" name=""/>
+                    <pic:cNvPicPr/>
+                  </pic:nvPicPr>
+                  <pic:blipFill>
+                    <a:blip r:embed="rId7">
+                      <a:extLst>
+                        <a:ext uri="{28A0092B-C50C-407E-A947-70E740481C1C}">
+                          <a14:useLocalDpi xmlns:a14="http://schemas.microsoft.com/office/drawing/2010/main" val="0"/>
+                        </a:ext>
+                      </a:extLst>
+                    </a:blip>
+                    <a:stretch>
+                      <a:fillRect/>
+                    </a:stretch>
+                  </pic:blipFill>
+                  <pic:spPr>
+                    <a:xfrm>
+                      <a:off x="0" y="0"/>
+                      <a:ext cx="6286257" cy="1873480"/>
+                    </a:xfrm>
+                    <a:prstGeom prst="rect">
+                      <a:avLst/>
+                    </a:prstGeom>
+                  </pic:spPr>
+                </pic:pic>
+              </a:graphicData>
+            </a:graphic>
+            <wp14:sizeRelH relativeFrom="margin">
+              <wp14:pctWidth>0</wp14:pctWidth>
+            </wp14:sizeRelH>
+            <wp14:sizeRelV relativeFrom="margin">
+              <wp14:pctHeight>0</wp14:pctHeight>
+            </wp14:sizeRelV>
+          </wp:anchor>
+        </w:drawing>
+      </w:r>
+    </w:p>
+    <w:p>
+      <w:pPr>
+        <w:spacing w:before="120" w:after="40"/>
         <w:rPr>
           <w:b/>
           <w:bCs/>
@@ -11826,10 +11173,11 @@
           <w:sz w:val="20"/>
           <w:szCs w:val="20"/>
         </w:rPr>
-        <w:t>Browse</w:t>
-      </w:r>
-      <w:proofErr w:type="spellEnd"/>
-      <w:r>
+      </w:pPr>
+    </w:p>
+    <w:p>
+      <w:pPr>
+        <w:spacing w:before="120" w:after="40"/>
         <w:rPr>
           <w:b/>
           <w:bCs/>
@@ -11837,10 +11185,11 @@
           <w:sz w:val="20"/>
           <w:szCs w:val="20"/>
         </w:rPr>
-        <w:t xml:space="preserve"> da ZZ2 — Ocorrências (legenda por %NC </w:t>
-      </w:r>
-      <w:proofErr w:type="spellStart"/>
-      <w:r>
+      </w:pPr>
+    </w:p>
+    <w:p>
+      <w:pPr>
+        <w:spacing w:before="120" w:after="40"/>
         <w:rPr>
           <w:b/>
           <w:bCs/>
@@ -11848,10 +11197,11 @@
           <w:sz w:val="20"/>
           <w:szCs w:val="20"/>
         </w:rPr>
-        <w:t>vs</w:t>
-      </w:r>
-      <w:proofErr w:type="spellEnd"/>
-      <w:r>
+      </w:pPr>
+    </w:p>
+    <w:p>
+      <w:pPr>
+        <w:spacing w:before="120" w:after="40"/>
         <w:rPr>
           <w:b/>
           <w:bCs/>
@@ -11859,186 +11209,16 @@
           <w:sz w:val="20"/>
           <w:szCs w:val="20"/>
         </w:rPr>
-        <w:t xml:space="preserve"> tolerância)</w:t>
-      </w:r>
-    </w:p>
-    <w:p>
-      <w:pPr>
-        <w:shd w:val="clear" w:color="auto" w:fill="F2F2F2"/>
-      </w:pPr>
-      <w:proofErr w:type="spellStart"/>
-      <w:r>
-        <w:rPr>
-          <w:rFonts w:ascii="Consolas" w:eastAsia="Consolas" w:hAnsi="Consolas" w:cs="Consolas"/>
-          <w:sz w:val="18"/>
-          <w:szCs w:val="18"/>
-        </w:rPr>
-        <w:t>Ocorrencias</w:t>
-      </w:r>
-      <w:proofErr w:type="spellEnd"/>
-      <w:r>
-        <w:rPr>
-          <w:rFonts w:ascii="Consolas" w:eastAsia="Consolas" w:hAnsi="Consolas" w:cs="Consolas"/>
-          <w:sz w:val="18"/>
-          <w:szCs w:val="18"/>
-        </w:rPr>
-        <w:t xml:space="preserve"> de Fornecedores (ISO 9001) - Controle 000001</w:t>
-      </w:r>
-    </w:p>
-    <w:p>
-      <w:pPr>
-        <w:shd w:val="clear" w:color="auto" w:fill="F2F2F2"/>
-      </w:pPr>
-      <w:r>
-        <w:rPr>
-          <w:rFonts w:ascii="Consolas" w:eastAsia="Consolas" w:hAnsi="Consolas" w:cs="Consolas"/>
-          <w:sz w:val="18"/>
-          <w:szCs w:val="18"/>
-        </w:rPr>
-        <w:t xml:space="preserve"> </w:t>
-      </w:r>
-      <w:proofErr w:type="spellStart"/>
-      <w:proofErr w:type="gramStart"/>
-      <w:r>
-        <w:rPr>
-          <w:rFonts w:ascii="Consolas" w:eastAsia="Consolas" w:hAnsi="Consolas" w:cs="Consolas"/>
-          <w:sz w:val="18"/>
-          <w:szCs w:val="18"/>
-        </w:rPr>
-        <w:t>Leg</w:t>
-      </w:r>
-      <w:proofErr w:type="spellEnd"/>
-      <w:r>
-        <w:rPr>
-          <w:rFonts w:ascii="Consolas" w:eastAsia="Consolas" w:hAnsi="Consolas" w:cs="Consolas"/>
-          <w:sz w:val="18"/>
-          <w:szCs w:val="18"/>
-        </w:rPr>
-        <w:t xml:space="preserve">  Controle</w:t>
-      </w:r>
-      <w:proofErr w:type="gramEnd"/>
-      <w:r>
-        <w:rPr>
-          <w:rFonts w:ascii="Consolas" w:eastAsia="Consolas" w:hAnsi="Consolas" w:cs="Consolas"/>
-          <w:sz w:val="18"/>
-          <w:szCs w:val="18"/>
-        </w:rPr>
-        <w:t xml:space="preserve">  Data        Produto  </w:t>
-      </w:r>
-      <w:proofErr w:type="spellStart"/>
-      <w:r>
-        <w:rPr>
-          <w:rFonts w:ascii="Consolas" w:eastAsia="Consolas" w:hAnsi="Consolas" w:cs="Consolas"/>
-          <w:sz w:val="18"/>
-          <w:szCs w:val="18"/>
-        </w:rPr>
-        <w:t>Qtd</w:t>
-      </w:r>
-      <w:proofErr w:type="spellEnd"/>
-      <w:r>
-        <w:rPr>
-          <w:rFonts w:ascii="Consolas" w:eastAsia="Consolas" w:hAnsi="Consolas" w:cs="Consolas"/>
-          <w:sz w:val="18"/>
-          <w:szCs w:val="18"/>
-        </w:rPr>
-        <w:t xml:space="preserve"> OK  </w:t>
-      </w:r>
-      <w:proofErr w:type="spellStart"/>
-      <w:r>
-        <w:rPr>
-          <w:rFonts w:ascii="Consolas" w:eastAsia="Consolas" w:hAnsi="Consolas" w:cs="Consolas"/>
-          <w:sz w:val="18"/>
-          <w:szCs w:val="18"/>
-        </w:rPr>
-        <w:t>Qtd</w:t>
-      </w:r>
-      <w:proofErr w:type="spellEnd"/>
-      <w:r>
-        <w:rPr>
-          <w:rFonts w:ascii="Consolas" w:eastAsia="Consolas" w:hAnsi="Consolas" w:cs="Consolas"/>
-          <w:sz w:val="18"/>
-          <w:szCs w:val="18"/>
-        </w:rPr>
-        <w:t xml:space="preserve"> NOK  %NC</w:t>
-      </w:r>
-    </w:p>
-    <w:p>
-      <w:pPr>
-        <w:shd w:val="clear" w:color="auto" w:fill="F2F2F2"/>
-      </w:pPr>
-      <w:r>
-        <w:rPr>
-          <w:rFonts w:ascii="Consolas" w:eastAsia="Consolas" w:hAnsi="Consolas" w:cs="Consolas"/>
-          <w:sz w:val="18"/>
-          <w:szCs w:val="18"/>
-        </w:rPr>
-        <w:lastRenderedPageBreak/>
-        <w:t xml:space="preserve"> (o)  000001    15/01/</w:t>
-      </w:r>
-      <w:proofErr w:type="gramStart"/>
-      <w:r>
-        <w:rPr>
-          <w:rFonts w:ascii="Consolas" w:eastAsia="Consolas" w:hAnsi="Consolas" w:cs="Consolas"/>
-          <w:sz w:val="18"/>
-          <w:szCs w:val="18"/>
-        </w:rPr>
-        <w:t>2025  PA</w:t>
-      </w:r>
-      <w:proofErr w:type="gramEnd"/>
-      <w:r>
-        <w:rPr>
-          <w:rFonts w:ascii="Consolas" w:eastAsia="Consolas" w:hAnsi="Consolas" w:cs="Consolas"/>
-          <w:sz w:val="18"/>
-          <w:szCs w:val="18"/>
-        </w:rPr>
-        <w:t>0001      900      100  10,00  &lt;- Vermelho (&gt;5%</w:t>
-      </w:r>
-      <w:r>
-        <w:rPr>
-          <w:rFonts w:ascii="Consolas" w:eastAsia="Consolas" w:hAnsi="Consolas" w:cs="Consolas"/>
-          <w:sz w:val="18"/>
-          <w:szCs w:val="18"/>
-        </w:rPr>
-        <w:t>)</w:t>
-      </w:r>
-    </w:p>
-    <w:p>
-      <w:pPr>
-        <w:shd w:val="clear" w:color="auto" w:fill="F2F2F2"/>
-        <w:spacing w:after="120"/>
-      </w:pPr>
-      <w:r>
-        <w:rPr>
-          <w:rFonts w:ascii="Consolas" w:eastAsia="Consolas" w:hAnsi="Consolas" w:cs="Consolas"/>
-          <w:sz w:val="18"/>
-          <w:szCs w:val="18"/>
-        </w:rPr>
-        <w:t xml:space="preserve"> (o)  000003 </w:t>
-      </w:r>
-      <w:proofErr w:type="gramStart"/>
-      <w:r>
-        <w:rPr>
-          <w:rFonts w:ascii="Consolas" w:eastAsia="Consolas" w:hAnsi="Consolas" w:cs="Consolas"/>
-          <w:sz w:val="18"/>
-          <w:szCs w:val="18"/>
-        </w:rPr>
-        <w:t xml:space="preserve">   [</w:t>
-      </w:r>
-      <w:proofErr w:type="gramEnd"/>
-      <w:r>
-        <w:rPr>
-          <w:rFonts w:ascii="Consolas" w:eastAsia="Consolas" w:hAnsi="Consolas" w:cs="Consolas"/>
-          <w:sz w:val="18"/>
-          <w:szCs w:val="18"/>
-        </w:rPr>
-        <w:t>hoje-1]    PA0003     1000        5   0,50  &lt;- Verde (&lt;=2%)</w:t>
-      </w:r>
+      </w:pPr>
     </w:p>
     <w:p>
       <w:pPr>
         <w:spacing w:before="120" w:after="40"/>
       </w:pPr>
-      <w:r>
+    </w:p>
+    <w:p>
+      <w:pPr>
+        <w:spacing w:before="120" w:after="40"/>
         <w:rPr>
           <w:b/>
           <w:bCs/>
@@ -12046,9 +11226,7 @@
           <w:sz w:val="20"/>
           <w:szCs w:val="20"/>
         </w:rPr>
-        <w:t>8.3 Ficha de manutenção (</w:t>
-      </w:r>
-      <w:proofErr w:type="spellStart"/>
+      </w:pPr>
       <w:r>
         <w:rPr>
           <w:b/>
@@ -12057,9 +11235,63 @@
           <w:sz w:val="20"/>
           <w:szCs w:val="20"/>
         </w:rPr>
-        <w:t>Enchoice</w:t>
-      </w:r>
-      <w:proofErr w:type="spellEnd"/>
+        <w:lastRenderedPageBreak/>
+        <w:drawing>
+          <wp:anchor distT="0" distB="0" distL="114300" distR="114300" simplePos="0" relativeHeight="251659264" behindDoc="0" locked="0" layoutInCell="1" allowOverlap="1" wp14:anchorId="5DF45F9F" wp14:editId="006F86B2">
+            <wp:simplePos x="0" y="0"/>
+            <wp:positionH relativeFrom="margin">
+              <wp:align>center</wp:align>
+            </wp:positionH>
+            <wp:positionV relativeFrom="paragraph">
+              <wp:posOffset>278130</wp:posOffset>
+            </wp:positionV>
+            <wp:extent cx="7147681" cy="1494845"/>
+            <wp:effectExtent l="0" t="0" r="0" b="0"/>
+            <wp:wrapNone/>
+            <wp:docPr id="2" name="Imagem 2"/>
+            <wp:cNvGraphicFramePr>
+              <a:graphicFrameLocks xmlns:a="http://schemas.openxmlformats.org/drawingml/2006/main" noChangeAspect="1"/>
+            </wp:cNvGraphicFramePr>
+            <a:graphic xmlns:a="http://schemas.openxmlformats.org/drawingml/2006/main">
+              <a:graphicData uri="http://schemas.openxmlformats.org/drawingml/2006/picture">
+                <pic:pic xmlns:pic="http://schemas.openxmlformats.org/drawingml/2006/picture">
+                  <pic:nvPicPr>
+                    <pic:cNvPr id="1" name=""/>
+                    <pic:cNvPicPr/>
+                  </pic:nvPicPr>
+                  <pic:blipFill>
+                    <a:blip r:embed="rId8">
+                      <a:extLst>
+                        <a:ext uri="{28A0092B-C50C-407E-A947-70E740481C1C}">
+                          <a14:useLocalDpi xmlns:a14="http://schemas.microsoft.com/office/drawing/2010/main" val="0"/>
+                        </a:ext>
+                      </a:extLst>
+                    </a:blip>
+                    <a:stretch>
+                      <a:fillRect/>
+                    </a:stretch>
+                  </pic:blipFill>
+                  <pic:spPr>
+                    <a:xfrm>
+                      <a:off x="0" y="0"/>
+                      <a:ext cx="7147681" cy="1494845"/>
+                    </a:xfrm>
+                    <a:prstGeom prst="rect">
+                      <a:avLst/>
+                    </a:prstGeom>
+                  </pic:spPr>
+                </pic:pic>
+              </a:graphicData>
+            </a:graphic>
+            <wp14:sizeRelH relativeFrom="margin">
+              <wp14:pctWidth>0</wp14:pctWidth>
+            </wp14:sizeRelH>
+            <wp14:sizeRelV relativeFrom="margin">
+              <wp14:pctHeight>0</wp14:pctHeight>
+            </wp14:sizeRelV>
+          </wp:anchor>
+        </w:drawing>
+      </w:r>
       <w:r>
         <w:rPr>
           <w:b/>
@@ -12068,268 +11300,416 @@
           <w:sz w:val="20"/>
           <w:szCs w:val="20"/>
         </w:rPr>
+        <w:t xml:space="preserve">8.2 </w:t>
+      </w:r>
+      <w:proofErr w:type="spellStart"/>
+      <w:r>
+        <w:rPr>
+          <w:b/>
+          <w:bCs/>
+          <w:color w:val="2E5496"/>
+          <w:sz w:val="20"/>
+          <w:szCs w:val="20"/>
+        </w:rPr>
+        <w:t>Browse</w:t>
+      </w:r>
+      <w:proofErr w:type="spellEnd"/>
+      <w:r>
+        <w:rPr>
+          <w:b/>
+          <w:bCs/>
+          <w:color w:val="2E5496"/>
+          <w:sz w:val="20"/>
+          <w:szCs w:val="20"/>
+        </w:rPr>
+        <w:t xml:space="preserve"> da ZZ2 — Ocorrências (legenda por %NC </w:t>
+      </w:r>
+      <w:proofErr w:type="spellStart"/>
+      <w:r>
+        <w:rPr>
+          <w:b/>
+          <w:bCs/>
+          <w:color w:val="2E5496"/>
+          <w:sz w:val="20"/>
+          <w:szCs w:val="20"/>
+        </w:rPr>
+        <w:t>vs</w:t>
+      </w:r>
+      <w:proofErr w:type="spellEnd"/>
+      <w:r>
+        <w:rPr>
+          <w:b/>
+          <w:bCs/>
+          <w:color w:val="2E5496"/>
+          <w:sz w:val="20"/>
+          <w:szCs w:val="20"/>
+        </w:rPr>
+        <w:t xml:space="preserve"> tolerância)</w:t>
+      </w:r>
+    </w:p>
+    <w:p>
+      <w:pPr>
+        <w:spacing w:before="120" w:after="40"/>
+        <w:rPr>
+          <w:b/>
+          <w:bCs/>
+          <w:color w:val="2E5496"/>
+          <w:sz w:val="20"/>
+          <w:szCs w:val="20"/>
+        </w:rPr>
+      </w:pPr>
+    </w:p>
+    <w:p>
+      <w:pPr>
+        <w:spacing w:before="120" w:after="40"/>
+        <w:rPr>
+          <w:b/>
+          <w:bCs/>
+          <w:color w:val="2E5496"/>
+          <w:sz w:val="20"/>
+          <w:szCs w:val="20"/>
+        </w:rPr>
+      </w:pPr>
+    </w:p>
+    <w:p>
+      <w:pPr>
+        <w:spacing w:before="120" w:after="40"/>
+        <w:rPr>
+          <w:b/>
+          <w:bCs/>
+          <w:color w:val="2E5496"/>
+          <w:sz w:val="20"/>
+          <w:szCs w:val="20"/>
+        </w:rPr>
+      </w:pPr>
+    </w:p>
+    <w:p>
+      <w:pPr>
+        <w:spacing w:before="120" w:after="40"/>
+        <w:rPr>
+          <w:b/>
+          <w:bCs/>
+          <w:color w:val="2E5496"/>
+          <w:sz w:val="20"/>
+          <w:szCs w:val="20"/>
+        </w:rPr>
+      </w:pPr>
+    </w:p>
+    <w:p>
+      <w:pPr>
+        <w:spacing w:before="120" w:after="40"/>
+        <w:rPr>
+          <w:b/>
+          <w:bCs/>
+          <w:color w:val="2E5496"/>
+          <w:sz w:val="20"/>
+          <w:szCs w:val="20"/>
+        </w:rPr>
+      </w:pPr>
+    </w:p>
+    <w:p>
+      <w:pPr>
+        <w:spacing w:before="120" w:after="40"/>
+        <w:rPr>
+          <w:b/>
+          <w:bCs/>
+          <w:color w:val="2E5496"/>
+          <w:sz w:val="20"/>
+          <w:szCs w:val="20"/>
+        </w:rPr>
+      </w:pPr>
+    </w:p>
+    <w:p>
+      <w:pPr>
+        <w:spacing w:before="120" w:after="40"/>
+      </w:pPr>
+    </w:p>
+    <w:p>
+      <w:pPr>
+        <w:spacing w:before="120" w:after="40"/>
+        <w:rPr>
+          <w:b/>
+          <w:bCs/>
+          <w:color w:val="2E5496"/>
+          <w:sz w:val="20"/>
+          <w:szCs w:val="20"/>
+        </w:rPr>
+      </w:pPr>
+      <w:r>
+        <w:rPr>
+          <w:b/>
+          <w:bCs/>
+          <w:color w:val="2E5496"/>
+          <w:sz w:val="20"/>
+          <w:szCs w:val="20"/>
+        </w:rPr>
+        <w:t>8.3 Ficha de manutenção (</w:t>
+      </w:r>
+      <w:proofErr w:type="spellStart"/>
+      <w:r>
+        <w:rPr>
+          <w:b/>
+          <w:bCs/>
+          <w:color w:val="2E5496"/>
+          <w:sz w:val="20"/>
+          <w:szCs w:val="20"/>
+        </w:rPr>
+        <w:t>Enchoice</w:t>
+      </w:r>
+      <w:proofErr w:type="spellEnd"/>
+      <w:r>
+        <w:rPr>
+          <w:b/>
+          <w:bCs/>
+          <w:color w:val="2E5496"/>
+          <w:sz w:val="20"/>
+          <w:szCs w:val="20"/>
+        </w:rPr>
         <w:t>) — inclusão de ZZ1</w:t>
       </w:r>
     </w:p>
     <w:p>
       <w:pPr>
-        <w:shd w:val="clear" w:color="auto" w:fill="F2F2F2"/>
-      </w:pPr>
-      <w:proofErr w:type="spellStart"/>
-      <w:r>
-        <w:rPr>
-          <w:rFonts w:ascii="Consolas" w:eastAsia="Consolas" w:hAnsi="Consolas" w:cs="Consolas"/>
-          <w:sz w:val="18"/>
-          <w:szCs w:val="18"/>
-        </w:rPr>
-        <w:t>Codigo</w:t>
-      </w:r>
-      <w:proofErr w:type="spellEnd"/>
-      <w:r>
-        <w:rPr>
-          <w:rFonts w:ascii="Consolas" w:eastAsia="Consolas" w:hAnsi="Consolas" w:cs="Consolas"/>
-          <w:sz w:val="18"/>
-          <w:szCs w:val="18"/>
-        </w:rPr>
-        <w:t>......: 000004</w:t>
-      </w:r>
-    </w:p>
-    <w:p>
-      <w:pPr>
-        <w:shd w:val="clear" w:color="auto" w:fill="F2F2F2"/>
-      </w:pPr>
-      <w:proofErr w:type="spellStart"/>
-      <w:proofErr w:type="gramStart"/>
-      <w:r>
-        <w:rPr>
-          <w:rFonts w:ascii="Consolas" w:eastAsia="Consolas" w:hAnsi="Consolas" w:cs="Consolas"/>
-          <w:sz w:val="18"/>
-          <w:szCs w:val="18"/>
-        </w:rPr>
-        <w:t>Cod.Fornec</w:t>
-      </w:r>
-      <w:proofErr w:type="spellEnd"/>
-      <w:r>
-        <w:rPr>
-          <w:rFonts w:ascii="Consolas" w:eastAsia="Consolas" w:hAnsi="Consolas" w:cs="Consolas"/>
-          <w:sz w:val="18"/>
-          <w:szCs w:val="18"/>
-        </w:rPr>
-        <w:t>..</w:t>
-      </w:r>
-      <w:proofErr w:type="gramEnd"/>
-      <w:r>
-        <w:rPr>
-          <w:rFonts w:ascii="Consolas" w:eastAsia="Consolas" w:hAnsi="Consolas" w:cs="Consolas"/>
-          <w:sz w:val="18"/>
-          <w:szCs w:val="18"/>
-        </w:rPr>
-        <w:t>: 000001   Loja: 01   [F3]</w:t>
-      </w:r>
-    </w:p>
-    <w:p>
-      <w:pPr>
-        <w:shd w:val="clear" w:color="auto" w:fill="F2F2F2"/>
-      </w:pPr>
-      <w:r>
-        <w:rPr>
-          <w:rFonts w:ascii="Consolas" w:eastAsia="Consolas" w:hAnsi="Consolas" w:cs="Consolas"/>
-          <w:sz w:val="18"/>
-          <w:szCs w:val="18"/>
-        </w:rPr>
-        <w:t xml:space="preserve">Nome </w:t>
-      </w:r>
-      <w:proofErr w:type="spellStart"/>
-      <w:r>
-        <w:rPr>
-          <w:rFonts w:ascii="Consolas" w:eastAsia="Consolas" w:hAnsi="Consolas" w:cs="Consolas"/>
-          <w:sz w:val="18"/>
-          <w:szCs w:val="18"/>
-        </w:rPr>
-        <w:t>Fornec</w:t>
-      </w:r>
-      <w:proofErr w:type="spellEnd"/>
-      <w:r>
-        <w:rPr>
-          <w:rFonts w:ascii="Consolas" w:eastAsia="Consolas" w:hAnsi="Consolas" w:cs="Consolas"/>
-          <w:sz w:val="18"/>
-          <w:szCs w:val="18"/>
-        </w:rPr>
-        <w:t>.: METALURGICA ACO FORTE LTDA</w:t>
-      </w:r>
-      <w:proofErr w:type="gramStart"/>
-      <w:r>
-        <w:rPr>
-          <w:rFonts w:ascii="Consolas" w:eastAsia="Consolas" w:hAnsi="Consolas" w:cs="Consolas"/>
-          <w:sz w:val="18"/>
-          <w:szCs w:val="18"/>
-        </w:rPr>
-        <w:t xml:space="preserve">   (</w:t>
-      </w:r>
-      <w:proofErr w:type="gramEnd"/>
-      <w:r>
-        <w:rPr>
-          <w:rFonts w:ascii="Consolas" w:eastAsia="Consolas" w:hAnsi="Consolas" w:cs="Consolas"/>
-          <w:sz w:val="18"/>
-          <w:szCs w:val="18"/>
-        </w:rPr>
-        <w:t>gatilho/virtual)</w:t>
-      </w:r>
-    </w:p>
-    <w:p>
-      <w:pPr>
-        <w:shd w:val="clear" w:color="auto" w:fill="F2F2F2"/>
-      </w:pPr>
-      <w:r>
-        <w:rPr>
-          <w:rFonts w:ascii="Consolas" w:eastAsia="Consolas" w:hAnsi="Consolas" w:cs="Consolas"/>
-          <w:sz w:val="18"/>
-          <w:szCs w:val="18"/>
-        </w:rPr>
-        <w:t>Dad</w:t>
-      </w:r>
-      <w:r>
-        <w:rPr>
-          <w:rFonts w:ascii="Consolas" w:eastAsia="Consolas" w:hAnsi="Consolas" w:cs="Consolas"/>
-          <w:sz w:val="18"/>
-          <w:szCs w:val="18"/>
-        </w:rPr>
-        <w:t xml:space="preserve">os </w:t>
-      </w:r>
-      <w:proofErr w:type="spellStart"/>
-      <w:proofErr w:type="gramStart"/>
-      <w:r>
-        <w:rPr>
-          <w:rFonts w:ascii="Consolas" w:eastAsia="Consolas" w:hAnsi="Consolas" w:cs="Consolas"/>
-          <w:sz w:val="18"/>
-          <w:szCs w:val="18"/>
-        </w:rPr>
-        <w:t>Cert</w:t>
-      </w:r>
-      <w:proofErr w:type="spellEnd"/>
-      <w:r>
-        <w:rPr>
-          <w:rFonts w:ascii="Consolas" w:eastAsia="Consolas" w:hAnsi="Consolas" w:cs="Consolas"/>
-          <w:sz w:val="18"/>
-          <w:szCs w:val="18"/>
-        </w:rPr>
-        <w:t>..</w:t>
-      </w:r>
-      <w:proofErr w:type="gramEnd"/>
-      <w:r>
-        <w:rPr>
-          <w:rFonts w:ascii="Consolas" w:eastAsia="Consolas" w:hAnsi="Consolas" w:cs="Consolas"/>
-          <w:sz w:val="18"/>
-          <w:szCs w:val="18"/>
-        </w:rPr>
-        <w:t xml:space="preserve">: ISO 9001:2015 - </w:t>
-      </w:r>
-      <w:proofErr w:type="spellStart"/>
-      <w:r>
-        <w:rPr>
-          <w:rFonts w:ascii="Consolas" w:eastAsia="Consolas" w:hAnsi="Consolas" w:cs="Consolas"/>
-          <w:sz w:val="18"/>
-          <w:szCs w:val="18"/>
-        </w:rPr>
-        <w:t>Certif</w:t>
-      </w:r>
-      <w:proofErr w:type="spellEnd"/>
-      <w:r>
-        <w:rPr>
-          <w:rFonts w:ascii="Consolas" w:eastAsia="Consolas" w:hAnsi="Consolas" w:cs="Consolas"/>
-          <w:sz w:val="18"/>
-          <w:szCs w:val="18"/>
-        </w:rPr>
-        <w:t>. 98765</w:t>
-      </w:r>
-    </w:p>
-    <w:p>
-      <w:pPr>
-        <w:shd w:val="clear" w:color="auto" w:fill="F2F2F2"/>
-      </w:pPr>
-      <w:proofErr w:type="spellStart"/>
-      <w:r>
-        <w:rPr>
-          <w:rFonts w:ascii="Consolas" w:eastAsia="Consolas" w:hAnsi="Consolas" w:cs="Consolas"/>
-          <w:sz w:val="18"/>
-          <w:szCs w:val="18"/>
-        </w:rPr>
-        <w:t>Val.Cert</w:t>
-      </w:r>
-      <w:proofErr w:type="spellEnd"/>
-      <w:r>
-        <w:rPr>
-          <w:rFonts w:ascii="Consolas" w:eastAsia="Consolas" w:hAnsi="Consolas" w:cs="Consolas"/>
-          <w:sz w:val="18"/>
-          <w:szCs w:val="18"/>
-        </w:rPr>
-        <w:t>....: 31/12/2026</w:t>
-      </w:r>
-    </w:p>
-    <w:p>
-      <w:pPr>
-        <w:shd w:val="clear" w:color="auto" w:fill="F2F2F2"/>
-      </w:pPr>
-      <w:proofErr w:type="spellStart"/>
-      <w:proofErr w:type="gramStart"/>
-      <w:r>
-        <w:rPr>
-          <w:rFonts w:ascii="Consolas" w:eastAsia="Consolas" w:hAnsi="Consolas" w:cs="Consolas"/>
-          <w:sz w:val="18"/>
-          <w:szCs w:val="18"/>
-        </w:rPr>
-        <w:t>Tolerancia</w:t>
-      </w:r>
-      <w:proofErr w:type="spellEnd"/>
-      <w:r>
-        <w:rPr>
-          <w:rFonts w:ascii="Consolas" w:eastAsia="Consolas" w:hAnsi="Consolas" w:cs="Consolas"/>
-          <w:sz w:val="18"/>
-          <w:szCs w:val="18"/>
-        </w:rPr>
-        <w:t>..</w:t>
-      </w:r>
-      <w:proofErr w:type="gramEnd"/>
-      <w:r>
-        <w:rPr>
-          <w:rFonts w:ascii="Consolas" w:eastAsia="Consolas" w:hAnsi="Consolas" w:cs="Consolas"/>
-          <w:sz w:val="18"/>
-          <w:szCs w:val="18"/>
-        </w:rPr>
-        <w:t>: 5,00</w:t>
-      </w:r>
-    </w:p>
-    <w:p>
-      <w:pPr>
-        <w:shd w:val="clear" w:color="auto" w:fill="F2F2F2"/>
-        <w:spacing w:after="120"/>
-      </w:pPr>
-      <w:r>
-        <w:rPr>
-          <w:rFonts w:ascii="Consolas" w:eastAsia="Consolas" w:hAnsi="Consolas" w:cs="Consolas"/>
-          <w:sz w:val="18"/>
-          <w:szCs w:val="18"/>
-        </w:rPr>
-        <w:t>[</w:t>
-      </w:r>
-      <w:proofErr w:type="gramStart"/>
-      <w:r>
-        <w:rPr>
-          <w:rFonts w:ascii="Consolas" w:eastAsia="Consolas" w:hAnsi="Consolas" w:cs="Consolas"/>
-          <w:sz w:val="18"/>
-          <w:szCs w:val="18"/>
-        </w:rPr>
-        <w:t>Confirmar]  -</w:t>
-      </w:r>
-      <w:proofErr w:type="gramEnd"/>
-      <w:r>
-        <w:rPr>
-          <w:rFonts w:ascii="Consolas" w:eastAsia="Consolas" w:hAnsi="Consolas" w:cs="Consolas"/>
-          <w:sz w:val="18"/>
-          <w:szCs w:val="18"/>
-        </w:rPr>
-        <w:t>&gt; U_ST1TudoOk valida antes de gravar</w:t>
-      </w:r>
+        <w:spacing w:before="120" w:after="40"/>
+        <w:rPr>
+          <w:b/>
+          <w:bCs/>
+          <w:color w:val="2E5496"/>
+          <w:sz w:val="20"/>
+          <w:szCs w:val="20"/>
+        </w:rPr>
+      </w:pPr>
+      <w:r>
+        <w:rPr>
+          <w:b/>
+          <w:bCs/>
+          <w:color w:val="2E5496"/>
+          <w:sz w:val="20"/>
+          <w:szCs w:val="20"/>
+        </w:rPr>
+        <w:drawing>
+          <wp:anchor distT="0" distB="0" distL="114300" distR="114300" simplePos="0" relativeHeight="251660288" behindDoc="0" locked="0" layoutInCell="1" allowOverlap="1" wp14:anchorId="209E4B3A" wp14:editId="1331D7A2">
+            <wp:simplePos x="0" y="0"/>
+            <wp:positionH relativeFrom="column">
+              <wp:posOffset>0</wp:posOffset>
+            </wp:positionH>
+            <wp:positionV relativeFrom="paragraph">
+              <wp:posOffset>50249</wp:posOffset>
+            </wp:positionV>
+            <wp:extent cx="5731510" cy="3766185"/>
+            <wp:effectExtent l="0" t="0" r="2540" b="5715"/>
+            <wp:wrapNone/>
+            <wp:docPr id="3" name="Imagem 3"/>
+            <wp:cNvGraphicFramePr>
+              <a:graphicFrameLocks xmlns:a="http://schemas.openxmlformats.org/drawingml/2006/main" noChangeAspect="1"/>
+            </wp:cNvGraphicFramePr>
+            <a:graphic xmlns:a="http://schemas.openxmlformats.org/drawingml/2006/main">
+              <a:graphicData uri="http://schemas.openxmlformats.org/drawingml/2006/picture">
+                <pic:pic xmlns:pic="http://schemas.openxmlformats.org/drawingml/2006/picture">
+                  <pic:nvPicPr>
+                    <pic:cNvPr id="1" name=""/>
+                    <pic:cNvPicPr/>
+                  </pic:nvPicPr>
+                  <pic:blipFill>
+                    <a:blip r:embed="rId9">
+                      <a:extLst>
+                        <a:ext uri="{28A0092B-C50C-407E-A947-70E740481C1C}">
+                          <a14:useLocalDpi xmlns:a14="http://schemas.microsoft.com/office/drawing/2010/main" val="0"/>
+                        </a:ext>
+                      </a:extLst>
+                    </a:blip>
+                    <a:stretch>
+                      <a:fillRect/>
+                    </a:stretch>
+                  </pic:blipFill>
+                  <pic:spPr>
+                    <a:xfrm>
+                      <a:off x="0" y="0"/>
+                      <a:ext cx="5731510" cy="3766185"/>
+                    </a:xfrm>
+                    <a:prstGeom prst="rect">
+                      <a:avLst/>
+                    </a:prstGeom>
+                  </pic:spPr>
+                </pic:pic>
+              </a:graphicData>
+            </a:graphic>
+          </wp:anchor>
+        </w:drawing>
+      </w:r>
+    </w:p>
+    <w:p>
+      <w:pPr>
+        <w:spacing w:before="120" w:after="40"/>
+        <w:rPr>
+          <w:b/>
+          <w:bCs/>
+          <w:color w:val="2E5496"/>
+          <w:sz w:val="20"/>
+          <w:szCs w:val="20"/>
+        </w:rPr>
+      </w:pPr>
+    </w:p>
+    <w:p>
+      <w:pPr>
+        <w:spacing w:before="120" w:after="40"/>
+        <w:rPr>
+          <w:b/>
+          <w:bCs/>
+          <w:color w:val="2E5496"/>
+          <w:sz w:val="20"/>
+          <w:szCs w:val="20"/>
+        </w:rPr>
+      </w:pPr>
+    </w:p>
+    <w:p>
+      <w:pPr>
+        <w:spacing w:before="120" w:after="40"/>
+        <w:rPr>
+          <w:b/>
+          <w:bCs/>
+          <w:color w:val="2E5496"/>
+          <w:sz w:val="20"/>
+          <w:szCs w:val="20"/>
+        </w:rPr>
+      </w:pPr>
+    </w:p>
+    <w:p>
+      <w:pPr>
+        <w:spacing w:before="120" w:after="40"/>
+        <w:rPr>
+          <w:b/>
+          <w:bCs/>
+          <w:color w:val="2E5496"/>
+          <w:sz w:val="20"/>
+          <w:szCs w:val="20"/>
+        </w:rPr>
+      </w:pPr>
+    </w:p>
+    <w:p>
+      <w:pPr>
+        <w:spacing w:before="120" w:after="40"/>
+        <w:rPr>
+          <w:b/>
+          <w:bCs/>
+          <w:color w:val="2E5496"/>
+          <w:sz w:val="20"/>
+          <w:szCs w:val="20"/>
+        </w:rPr>
+      </w:pPr>
+    </w:p>
+    <w:p>
+      <w:pPr>
+        <w:spacing w:before="120" w:after="40"/>
+        <w:rPr>
+          <w:b/>
+          <w:bCs/>
+          <w:color w:val="2E5496"/>
+          <w:sz w:val="20"/>
+          <w:szCs w:val="20"/>
+        </w:rPr>
+      </w:pPr>
+    </w:p>
+    <w:p>
+      <w:pPr>
+        <w:spacing w:before="120" w:after="40"/>
+        <w:rPr>
+          <w:b/>
+          <w:bCs/>
+          <w:color w:val="2E5496"/>
+          <w:sz w:val="20"/>
+          <w:szCs w:val="20"/>
+        </w:rPr>
+      </w:pPr>
+    </w:p>
+    <w:p>
+      <w:pPr>
+        <w:spacing w:before="120" w:after="40"/>
+        <w:rPr>
+          <w:b/>
+          <w:bCs/>
+          <w:color w:val="2E5496"/>
+          <w:sz w:val="20"/>
+          <w:szCs w:val="20"/>
+        </w:rPr>
+      </w:pPr>
+    </w:p>
+    <w:p>
+      <w:pPr>
+        <w:spacing w:before="120" w:after="40"/>
+        <w:rPr>
+          <w:b/>
+          <w:bCs/>
+          <w:color w:val="2E5496"/>
+          <w:sz w:val="20"/>
+          <w:szCs w:val="20"/>
+        </w:rPr>
+      </w:pPr>
+    </w:p>
+    <w:p>
+      <w:pPr>
+        <w:spacing w:before="120" w:after="40"/>
+        <w:rPr>
+          <w:b/>
+          <w:bCs/>
+          <w:color w:val="2E5496"/>
+          <w:sz w:val="20"/>
+          <w:szCs w:val="20"/>
+        </w:rPr>
+      </w:pPr>
+    </w:p>
+    <w:p>
+      <w:pPr>
+        <w:spacing w:before="120" w:after="40"/>
+        <w:rPr>
+          <w:b/>
+          <w:bCs/>
+          <w:color w:val="2E5496"/>
+          <w:sz w:val="20"/>
+          <w:szCs w:val="20"/>
+        </w:rPr>
+      </w:pPr>
+    </w:p>
+    <w:p>
+      <w:pPr>
+        <w:spacing w:before="120" w:after="40"/>
+        <w:rPr>
+          <w:b/>
+          <w:bCs/>
+          <w:color w:val="2E5496"/>
+          <w:sz w:val="20"/>
+          <w:szCs w:val="20"/>
+        </w:rPr>
+      </w:pPr>
+    </w:p>
+    <w:p>
+      <w:pPr>
+        <w:spacing w:before="120" w:after="40"/>
+        <w:rPr>
+          <w:b/>
+          <w:bCs/>
+          <w:color w:val="2E5496"/>
+          <w:sz w:val="20"/>
+          <w:szCs w:val="20"/>
+        </w:rPr>
+      </w:pPr>
+    </w:p>
+    <w:p>
+      <w:pPr>
+        <w:spacing w:before="120" w:after="40"/>
+        <w:rPr>
+          <w:b/>
+          <w:bCs/>
+          <w:color w:val="2E5496"/>
+          <w:sz w:val="20"/>
+          <w:szCs w:val="20"/>
+        </w:rPr>
+      </w:pPr>
+    </w:p>
+    <w:p>
+      <w:pPr>
+        <w:spacing w:before="120" w:after="40"/>
+      </w:pPr>
     </w:p>
     <w:p>
       <w:pPr>
@@ -12371,12 +11751,6 @@
         <w:gridCol w:w="6160"/>
       </w:tblGrid>
       <w:tr>
-        <w:tblPrEx>
-          <w:tblCellMar>
-            <w:top w:w="0" w:type="dxa"/>
-            <w:bottom w:w="0" w:type="dxa"/>
-          </w:tblCellMar>
-        </w:tblPrEx>
         <w:trPr>
           <w:tblHeader/>
         </w:trPr>
@@ -12430,12 +11804,6 @@
         </w:tc>
       </w:tr>
       <w:tr>
-        <w:tblPrEx>
-          <w:tblCellMar>
-            <w:top w:w="0" w:type="dxa"/>
-            <w:bottom w:w="0" w:type="dxa"/>
-          </w:tblCellMar>
-        </w:tblPrEx>
         <w:tc>
           <w:tcPr>
             <w:tcW w:w="3200" w:type="dxa"/>
@@ -12508,12 +11876,6 @@
         </w:tc>
       </w:tr>
       <w:tr>
-        <w:tblPrEx>
-          <w:tblCellMar>
-            <w:top w:w="0" w:type="dxa"/>
-            <w:bottom w:w="0" w:type="dxa"/>
-          </w:tblCellMar>
-        </w:tblPrEx>
         <w:tc>
           <w:tcPr>
             <w:tcW w:w="3200" w:type="dxa"/>
@@ -12578,12 +11940,6 @@
         </w:tc>
       </w:tr>
       <w:tr>
-        <w:tblPrEx>
-          <w:tblCellMar>
-            <w:top w:w="0" w:type="dxa"/>
-            <w:bottom w:w="0" w:type="dxa"/>
-          </w:tblCellMar>
-        </w:tblPrEx>
         <w:tc>
           <w:tcPr>
             <w:tcW w:w="3200" w:type="dxa"/>
@@ -12628,12 +11984,6 @@
         </w:tc>
       </w:tr>
       <w:tr>
-        <w:tblPrEx>
-          <w:tblCellMar>
-            <w:top w:w="0" w:type="dxa"/>
-            <w:bottom w:w="0" w:type="dxa"/>
-          </w:tblCellMar>
-        </w:tblPrEx>
         <w:tc>
           <w:tcPr>
             <w:tcW w:w="3200" w:type="dxa"/>
@@ -12680,12 +12030,6 @@
         </w:tc>
       </w:tr>
       <w:tr>
-        <w:tblPrEx>
-          <w:tblCellMar>
-            <w:top w:w="0" w:type="dxa"/>
-            <w:bottom w:w="0" w:type="dxa"/>
-          </w:tblCellMar>
-        </w:tblPrEx>
         <w:tc>
           <w:tcPr>
             <w:tcW w:w="3200" w:type="dxa"/>
@@ -12758,12 +12102,6 @@
         </w:tc>
       </w:tr>
       <w:tr>
-        <w:tblPrEx>
-          <w:tblCellMar>
-            <w:top w:w="0" w:type="dxa"/>
-            <w:bottom w:w="0" w:type="dxa"/>
-          </w:tblCellMar>
-        </w:tblPrEx>
         <w:tc>
           <w:tcPr>
             <w:tcW w:w="3200" w:type="dxa"/>
@@ -12810,12 +12148,6 @@
         </w:tc>
       </w:tr>
       <w:tr>
-        <w:tblPrEx>
-          <w:tblCellMar>
-            <w:top w:w="0" w:type="dxa"/>
-            <w:bottom w:w="0" w:type="dxa"/>
-          </w:tblCellMar>
-        </w:tblPrEx>
         <w:tc>
           <w:tcPr>
             <w:tcW w:w="3200" w:type="dxa"/>
@@ -12860,12 +12192,6 @@
         </w:tc>
       </w:tr>
       <w:tr>
-        <w:tblPrEx>
-          <w:tblCellMar>
-            <w:top w:w="0" w:type="dxa"/>
-            <w:bottom w:w="0" w:type="dxa"/>
-          </w:tblCellMar>
-        </w:tblPrEx>
         <w:tc>
           <w:tcPr>
             <w:tcW w:w="3200" w:type="dxa"/>
@@ -12912,12 +12238,6 @@
         </w:tc>
       </w:tr>
       <w:tr>
-        <w:tblPrEx>
-          <w:tblCellMar>
-            <w:top w:w="0" w:type="dxa"/>
-            <w:bottom w:w="0" w:type="dxa"/>
-          </w:tblCellMar>
-        </w:tblPrEx>
         <w:tc>
           <w:tcPr>
             <w:tcW w:w="3200" w:type="dxa"/>
@@ -12962,12 +12282,6 @@
         </w:tc>
       </w:tr>
       <w:tr>
-        <w:tblPrEx>
-          <w:tblCellMar>
-            <w:top w:w="0" w:type="dxa"/>
-            <w:bottom w:w="0" w:type="dxa"/>
-          </w:tblCellMar>
-        </w:tblPrEx>
         <w:tc>
           <w:tcPr>
             <w:tcW w:w="3200" w:type="dxa"/>
@@ -13034,12 +12348,6 @@
         </w:tc>
       </w:tr>
       <w:tr>
-        <w:tblPrEx>
-          <w:tblCellMar>
-            <w:top w:w="0" w:type="dxa"/>
-            <w:bottom w:w="0" w:type="dxa"/>
-          </w:tblCellMar>
-        </w:tblPrEx>
         <w:tc>
           <w:tcPr>
             <w:tcW w:w="3200" w:type="dxa"/>
@@ -13086,8 +12394,8 @@
     </w:tbl>
     <w:p/>
     <w:sectPr>
-      <w:headerReference w:type="default" r:id="rId7"/>
-      <w:footerReference w:type="default" r:id="rId8"/>
+      <w:headerReference w:type="default" r:id="rId10"/>
+      <w:footerReference w:type="default" r:id="rId11"/>
       <w:pgSz w:w="11906" w:h="16838"/>
       <w:pgMar w:top="1440" w:right="1440" w:bottom="1440" w:left="1440" w:header="708" w:footer="708" w:gutter="0"/>
       <w:cols w:space="720"/>

</xml_diff>